<commit_message>
Expand ASA path-planning experiments
</commit_message>
<xml_diff>
--- a/paper/Makalah_ASA_Robot_Path_Planning_UCS_Astar_RRTstar.docx
+++ b/paper/Makalah_ASA_Robot_Path_Planning_UCS_Astar_RRTstar.docx
@@ -101,10 +101,7 @@
         </w:rPr>
       </w:pPr>
       <w:r>
-        <w:rPr>
-          <w:lang w:val="id-ID"/>
-        </w:rPr>
-        <w:t>Abstract—Penelitian ini membahas penerapan Brute Force, kelompok Uniform Cost Search (UCS), Greedy Best First Search (GBFS), A*, dan Rapidly-exploring Random Tree Star (RRT*) pada simulasi pencarian jalur robot sepak bola humanoid di lapangan berhalangan. Sesuai ketentuan proyek, UCS, GBFS, dan A* diperlakukan sebagai satu kelompok strategi pencarian berbasis biaya dan heuristik, sedangkan Brute Force menjadi algoritma daftar kedua dan RRT* menjadi algoritma di luar daftar. Eksperimen dilakukan pada empat skenario peta dengan lima seed acak. Hasil menunjukkan bahwa A* mempertahankan biaya optimal seperti UCS dengan ekspansi simpul lebih sedikit, GBFS paling cepat tetapi tidak selalu optimal, Brute Force hanya efektif pada peta sederhana karena ruang enumerasi cepat membesar, dan RRT* relevan untuk ruang kontinu meskipun performanya lebih bergantung pada sampling.</w:t>
+        <w:t>Abstract—Penelitian ini membandingkan Brute Force berbasis waypoint, kelompok Uniform Cost Search (UCS), Greedy Best First Search (GBFS), A*, dan Rapidly-exploring Random Tree Star (RRT*) pada pencarian jalur robot sepak bola humanoid. Eksperimen utama menggunakan empat skenario, sepuluh seed peta yang dipastikan feasible, dan tiga pengulangan waktu per run. Analisis tambahan menguji enam resolusi grid serta enam tingkat kepadatan hambatan. Hasil menunjukkan bahwa A* selalu mempertahankan biaya UCS pada grid dengan ekspansi lebih terarah, GBFS paling cepat tetapi menghasilkan detour lebih besar, Brute Force kehilangan reliabilitas ketika hambatan bertambah, dan RRT* menyediakan lintasan kontinu dengan biaya sampling yang lebih variatif. Regresi empiris menunjukkan runtime UCS dan A* tumbuh mendekati linear terhadap jumlah sel pada rentang pengujian.</w:t>
       </w:r>
     </w:p>
     <w:p>
@@ -165,16 +162,7 @@
         </w:rPr>
       </w:pPr>
       <w:r>
-        <w:rPr>
-          <w:lang w:val="id-ID"/>
-        </w:rPr>
-        <w:t xml:space="preserve">Tujuan makalah ini adalah menerapkan dan membandingkan kelima algoritma tersebut pada peta simulasi yang sama. Kontribusi utama makalah adalah eksperimen komputasional yang memperlihatkan trade-off antara kelengkapan, biaya lintasan, waktu </w:t>
-      </w:r>
-      <w:r>
-        <w:rPr>
-          <w:lang w:val="id-ID"/>
-        </w:rPr>
-        <w:t>eksekusi, dan jumlah simpul atau kandidat yang diproses.</w:t>
+        <w:t>Penelitian ini memiliki tiga tujuan: (1) membandingkan kualitas, reliabilitas, waktu, dan beban processed kelima metode pada peta yang sama; (2) mengukur skalabilitas empiris UCS, GBFS, dan A* ketika resolusi grid meningkat; serta (3) menilai perubahan robustness seluruh metode ketika kepadatan hambatan bertambah.</w:t>
       </w:r>
     </w:p>
     <w:p>
@@ -434,10 +422,7 @@
         </w:rPr>
       </w:pPr>
       <w:r>
-        <w:rPr>
-          <w:lang w:val="id-ID"/>
-        </w:rPr>
-        <w:t>Empat metrik digunakan dalam eksperimen. Pertama, tingkat keberhasilan menunjukkan persentase percobaan yang berhasil menemukan jalur. Kedua, biaya lintasan menunjukkan panjang jalur yang dihasilkan. Ketiga, waktu eksekusi mengukur durasi komputasi dalam milidetik. Keempat, jumlah processed menunjukkan simpul grid, node sampling, atau kandidat waypoint yang diproses.</w:t>
+        <w:t>Lima metrik digunakan. Tingkat keberhasilan menyatakan persentase run yang menemukan jalur; biaya lintasan menyatakan panjang rute; detour ratio membagi biaya dengan jarak lurus start-goal agar kualitas dapat dibandingkan lintas representasi; waktu eksekusi dinyatakan dalam milidetik; dan processed mencatat kandidat waypoint, simpul grid, atau node sampling. Processed hanya dibandingkan langsung pada UCS, GBFS, dan A* karena ketiganya memakai satuan yang sama.</w:t>
       </w:r>
     </w:p>
     <w:p>
@@ -1581,17 +1566,7 @@
         </w:rPr>
       </w:pPr>
       <w:r>
-        <w:rPr>
-          <w:lang w:val="id-ID"/>
-        </w:rPr>
-        <w:t xml:space="preserve">Resolusi grid ditetapkan 60 x 40 sel, dengan lima seed acak untuk setiap skenario. Hasil setiap seed </w:t>
-      </w:r>
-      <w:r>
-        <w:rPr>
-          <w:lang w:val="id-ID"/>
-        </w:rPr>
-        <w:lastRenderedPageBreak/>
-        <w:t>disimpan dalam hasil_eksperimen.csv, sedangkan rata-rata biaya, waktu, tingkat keberhasilan, dan processed disimpan dalam ringkasan_eksperimen.csv. Seluruh visualisasi pada makalah dibuat ulang dari keluaran program yang sama.</w:t>
+        <w:t>Eksperimen utama memakai grid 60 x 40 dan sepuluh independent map seed per skenario. Generator melakukan resampling deterministik sampai A* memastikan start dan goal terhubung. Setiap runtime diukur tiga kali; median per peta kemudian diringkas dengan rata-rata dan simpangan baku antarseed. Data mentah dan ringkasan disimpan sebagai CSV.</w:t>
       </w:r>
     </w:p>
     <w:p>
@@ -2073,10 +2048,7 @@
         </w:rPr>
       </w:pPr>
       <w:r>
-        <w:rPr>
-          <w:lang w:val="id-ID"/>
-        </w:rPr>
-        <w:t>Setiap skenario diuji sebanyak lima kali dengan seed acak berbeda. Prosedur yang dilakukan adalah membangkitkan peta, menjalankan Brute Force, UCS, GBFS, A*, dan RRT*, lalu menyimpan biaya lintasan, waktu eksekusi, jumlah processed, dan status keberhasilan.</w:t>
+        <w:t>Setiap skenario diuji pada sepuluh peta feasible. Selain eksperimen utama, scaling grid memakai resolusi 30 x 20 sampai 120 x 80 dengan geometri ternormalisasi yang sama. Sweep kepadatan memakai 4, 8, 12, 16, 20, dan 24 hambatan nested per seed, sehingga setiap tingkat mempertahankan seluruh hambatan dari tingkat sebelumnya.</w:t>
       </w:r>
     </w:p>
     <w:p>
@@ -2404,6 +2376,12 @@
                 <m:t>grid 8 arah</m:t>
               </m:r>
             </m:oMath>
+            <w:r>
+              <w:rPr>
+                <w:lang w:val="id-ID"/>
+              </w:rPr>
+              <w:t xml:space="preserve"> </w:t>
+            </w:r>
             <w:r>
               <w:rPr>
                 <w:lang w:val="id-ID"/>
@@ -2931,10 +2909,7 @@
         </w:rPr>
       </w:pPr>
       <w:r>
-        <w:rPr>
-          <w:lang w:val="id-ID"/>
-        </w:rPr>
-        <w:t>Tabel IV menunjukkan ringkasan hasil eksperimen dari empat skenario. Nilai biaya, waktu, dan processed merupakan rata-rata dari lima percobaan. Jika suatu algoritma gagal pada sebagian seed, biaya rata-rata dihitung hanya dari percobaan yang berhasil sehingga tingkat keberhasilan harus dibaca bersama nilai biaya.</w:t>
+        <w:t>Tabel IV merangkum empat skenario dari sepuluh seed. Biaya dihitung hanya dari run yang berhasil, sehingga harus dibaca bersama tingkat keberhasilan. Waktu merupakan median dari tiga eksekusi per peta sebelum dirata-ratakan antarseed.</w:t>
       </w:r>
     </w:p>
     <w:p>
@@ -3138,18 +3113,7 @@
             </w:tcBorders>
           </w:tcPr>
           <w:p>
-            <w:pPr>
-              <w:pStyle w:val="tablecopy"/>
-              <w:rPr>
-                <w:b w:val="0"/>
-                <w:bCs w:val="0"/>
-              </w:rPr>
-            </w:pPr>
-            <w:r>
-              <w:rPr>
-                <w:b w:val="0"/>
-                <w:bCs w:val="0"/>
-              </w:rPr>
+            <w:r>
               <w:t>Mudah</w:t>
             </w:r>
           </w:p>
@@ -3163,10 +3127,6 @@
             </w:tcBorders>
           </w:tcPr>
           <w:p>
-            <w:pPr>
-              <w:pStyle w:val="tablecopy"/>
-              <w:cnfStyle w:val="000000100000" w:firstRow="0" w:lastRow="0" w:firstColumn="0" w:lastColumn="0" w:oddVBand="0" w:evenVBand="0" w:oddHBand="1" w:evenHBand="0" w:firstRowFirstColumn="0" w:firstRowLastColumn="0" w:lastRowFirstColumn="0" w:lastRowLastColumn="0"/>
-            </w:pPr>
             <w:r>
               <w:t>Brute Force</w:t>
             </w:r>
@@ -3181,10 +3141,6 @@
             </w:tcBorders>
           </w:tcPr>
           <w:p>
-            <w:pPr>
-              <w:pStyle w:val="tablecopy"/>
-              <w:cnfStyle w:val="000000100000" w:firstRow="0" w:lastRow="0" w:firstColumn="0" w:lastColumn="0" w:oddVBand="0" w:evenVBand="0" w:oddHBand="1" w:evenHBand="0" w:firstRowFirstColumn="0" w:firstRowLastColumn="0" w:lastRowFirstColumn="0" w:lastRowLastColumn="0"/>
-            </w:pPr>
             <w:r>
               <w:t>100%</w:t>
             </w:r>
@@ -3199,12 +3155,8 @@
             </w:tcBorders>
           </w:tcPr>
           <w:p>
-            <w:pPr>
-              <w:pStyle w:val="tablecopy"/>
-              <w:cnfStyle w:val="000000100000" w:firstRow="0" w:lastRow="0" w:firstColumn="0" w:lastColumn="0" w:oddVBand="0" w:evenVBand="0" w:oddHBand="1" w:evenHBand="0" w:firstRowFirstColumn="0" w:firstRowLastColumn="0" w:lastRowFirstColumn="0" w:lastRowLastColumn="0"/>
-            </w:pPr>
-            <w:r>
-              <w:t>53.34</w:t>
+            <w:r>
+              <w:t>53.36</w:t>
             </w:r>
           </w:p>
         </w:tc>
@@ -3217,12 +3169,8 @@
             </w:tcBorders>
           </w:tcPr>
           <w:p>
-            <w:pPr>
-              <w:pStyle w:val="tablecopy"/>
-              <w:cnfStyle w:val="000000100000" w:firstRow="0" w:lastRow="0" w:firstColumn="0" w:lastColumn="0" w:oddVBand="0" w:evenVBand="0" w:oddHBand="1" w:evenHBand="0" w:firstRowFirstColumn="0" w:firstRowLastColumn="0" w:lastRowFirstColumn="0" w:lastRowLastColumn="0"/>
-            </w:pPr>
-            <w:r>
-              <w:t>118.8</w:t>
+            <w:r>
+              <w:t>137.1</w:t>
             </w:r>
           </w:p>
         </w:tc>
@@ -3241,18 +3189,7 @@
             </w:tcBorders>
           </w:tcPr>
           <w:p>
-            <w:pPr>
-              <w:pStyle w:val="tablecopy"/>
-              <w:rPr>
-                <w:b w:val="0"/>
-                <w:bCs w:val="0"/>
-              </w:rPr>
-            </w:pPr>
-            <w:r>
-              <w:rPr>
-                <w:b w:val="0"/>
-                <w:bCs w:val="0"/>
-              </w:rPr>
+            <w:r>
               <w:t>Mudah</w:t>
             </w:r>
           </w:p>
@@ -3266,10 +3203,6 @@
             </w:tcBorders>
           </w:tcPr>
           <w:p>
-            <w:pPr>
-              <w:pStyle w:val="tablecopy"/>
-              <w:cnfStyle w:val="000000000000" w:firstRow="0" w:lastRow="0" w:firstColumn="0" w:lastColumn="0" w:oddVBand="0" w:evenVBand="0" w:oddHBand="0" w:evenHBand="0" w:firstRowFirstColumn="0" w:firstRowLastColumn="0" w:lastRowFirstColumn="0" w:lastRowLastColumn="0"/>
-            </w:pPr>
             <w:r>
               <w:t>UCS</w:t>
             </w:r>
@@ -3284,10 +3217,6 @@
             </w:tcBorders>
           </w:tcPr>
           <w:p>
-            <w:pPr>
-              <w:pStyle w:val="tablecopy"/>
-              <w:cnfStyle w:val="000000000000" w:firstRow="0" w:lastRow="0" w:firstColumn="0" w:lastColumn="0" w:oddVBand="0" w:evenVBand="0" w:oddHBand="0" w:evenHBand="0" w:firstRowFirstColumn="0" w:firstRowLastColumn="0" w:lastRowFirstColumn="0" w:lastRowLastColumn="0"/>
-            </w:pPr>
             <w:r>
               <w:t>100%</w:t>
             </w:r>
@@ -3302,30 +3231,22 @@
             </w:tcBorders>
           </w:tcPr>
           <w:p>
-            <w:pPr>
-              <w:pStyle w:val="tablecopy"/>
-              <w:cnfStyle w:val="000000000000" w:firstRow="0" w:lastRow="0" w:firstColumn="0" w:lastColumn="0" w:oddVBand="0" w:evenVBand="0" w:oddHBand="0" w:evenHBand="0" w:firstRowFirstColumn="0" w:firstRowLastColumn="0" w:lastRowFirstColumn="0" w:lastRowLastColumn="0"/>
-            </w:pPr>
-            <w:r>
-              <w:t>54.82</w:t>
-            </w:r>
-          </w:p>
-        </w:tc>
-        <w:tc>
-          <w:tcPr>
-            <w:tcW w:w="0" w:type="auto"/>
-            <w:tcBorders>
-              <w:top w:val="nil"/>
-              <w:bottom w:val="nil"/>
-            </w:tcBorders>
-          </w:tcPr>
-          <w:p>
-            <w:pPr>
-              <w:pStyle w:val="tablecopy"/>
-              <w:cnfStyle w:val="000000000000" w:firstRow="0" w:lastRow="0" w:firstColumn="0" w:lastColumn="0" w:oddVBand="0" w:evenVBand="0" w:oddHBand="0" w:evenHBand="0" w:firstRowFirstColumn="0" w:firstRowLastColumn="0" w:lastRowFirstColumn="0" w:lastRowLastColumn="0"/>
-            </w:pPr>
-            <w:r>
-              <w:t>240.2</w:t>
+            <w:r>
+              <w:t>54.74</w:t>
+            </w:r>
+          </w:p>
+        </w:tc>
+        <w:tc>
+          <w:tcPr>
+            <w:tcW w:w="0" w:type="auto"/>
+            <w:tcBorders>
+              <w:top w:val="nil"/>
+              <w:bottom w:val="nil"/>
+            </w:tcBorders>
+          </w:tcPr>
+          <w:p>
+            <w:r>
+              <w:t>300.3</w:t>
             </w:r>
           </w:p>
         </w:tc>
@@ -3345,18 +3266,7 @@
             </w:tcBorders>
           </w:tcPr>
           <w:p>
-            <w:pPr>
-              <w:pStyle w:val="tablecopy"/>
-              <w:rPr>
-                <w:b w:val="0"/>
-                <w:bCs w:val="0"/>
-              </w:rPr>
-            </w:pPr>
-            <w:r>
-              <w:rPr>
-                <w:b w:val="0"/>
-                <w:bCs w:val="0"/>
-              </w:rPr>
+            <w:r>
               <w:t>Mudah</w:t>
             </w:r>
           </w:p>
@@ -3370,10 +3280,6 @@
             </w:tcBorders>
           </w:tcPr>
           <w:p>
-            <w:pPr>
-              <w:pStyle w:val="tablecopy"/>
-              <w:cnfStyle w:val="000000100000" w:firstRow="0" w:lastRow="0" w:firstColumn="0" w:lastColumn="0" w:oddVBand="0" w:evenVBand="0" w:oddHBand="1" w:evenHBand="0" w:firstRowFirstColumn="0" w:firstRowLastColumn="0" w:lastRowFirstColumn="0" w:lastRowLastColumn="0"/>
-            </w:pPr>
             <w:r>
               <w:t>GBFS</w:t>
             </w:r>
@@ -3388,10 +3294,6 @@
             </w:tcBorders>
           </w:tcPr>
           <w:p>
-            <w:pPr>
-              <w:pStyle w:val="tablecopy"/>
-              <w:cnfStyle w:val="000000100000" w:firstRow="0" w:lastRow="0" w:firstColumn="0" w:lastColumn="0" w:oddVBand="0" w:evenVBand="0" w:oddHBand="1" w:evenHBand="0" w:firstRowFirstColumn="0" w:firstRowLastColumn="0" w:lastRowFirstColumn="0" w:lastRowLastColumn="0"/>
-            </w:pPr>
             <w:r>
               <w:t>100%</w:t>
             </w:r>
@@ -3406,30 +3308,22 @@
             </w:tcBorders>
           </w:tcPr>
           <w:p>
-            <w:pPr>
-              <w:pStyle w:val="tablecopy"/>
-              <w:cnfStyle w:val="000000100000" w:firstRow="0" w:lastRow="0" w:firstColumn="0" w:lastColumn="0" w:oddVBand="0" w:evenVBand="0" w:oddHBand="1" w:evenHBand="0" w:firstRowFirstColumn="0" w:firstRowLastColumn="0" w:lastRowFirstColumn="0" w:lastRowLastColumn="0"/>
-            </w:pPr>
-            <w:r>
-              <w:t>55.44</w:t>
-            </w:r>
-          </w:p>
-        </w:tc>
-        <w:tc>
-          <w:tcPr>
-            <w:tcW w:w="0" w:type="auto"/>
-            <w:tcBorders>
-              <w:top w:val="nil"/>
-              <w:bottom w:val="nil"/>
-            </w:tcBorders>
-          </w:tcPr>
-          <w:p>
-            <w:pPr>
-              <w:pStyle w:val="tablecopy"/>
-              <w:cnfStyle w:val="000000100000" w:firstRow="0" w:lastRow="0" w:firstColumn="0" w:lastColumn="0" w:oddVBand="0" w:evenVBand="0" w:oddHBand="1" w:evenHBand="0" w:firstRowFirstColumn="0" w:firstRowLastColumn="0" w:lastRowFirstColumn="0" w:lastRowLastColumn="0"/>
-            </w:pPr>
-            <w:r>
-              <w:t>7.4</w:t>
+            <w:r>
+              <w:t>55.30</w:t>
+            </w:r>
+          </w:p>
+        </w:tc>
+        <w:tc>
+          <w:tcPr>
+            <w:tcW w:w="0" w:type="auto"/>
+            <w:tcBorders>
+              <w:top w:val="nil"/>
+              <w:bottom w:val="nil"/>
+            </w:tcBorders>
+          </w:tcPr>
+          <w:p>
+            <w:r>
+              <w:t>8.3</w:t>
             </w:r>
           </w:p>
         </w:tc>
@@ -3448,18 +3342,7 @@
             </w:tcBorders>
           </w:tcPr>
           <w:p>
-            <w:pPr>
-              <w:pStyle w:val="tablecopy"/>
-              <w:rPr>
-                <w:b w:val="0"/>
-                <w:bCs w:val="0"/>
-              </w:rPr>
-            </w:pPr>
-            <w:r>
-              <w:rPr>
-                <w:b w:val="0"/>
-                <w:bCs w:val="0"/>
-              </w:rPr>
+            <w:r>
               <w:t>Mudah</w:t>
             </w:r>
           </w:p>
@@ -3473,10 +3356,6 @@
             </w:tcBorders>
           </w:tcPr>
           <w:p>
-            <w:pPr>
-              <w:pStyle w:val="tablecopy"/>
-              <w:cnfStyle w:val="000000000000" w:firstRow="0" w:lastRow="0" w:firstColumn="0" w:lastColumn="0" w:oddVBand="0" w:evenVBand="0" w:oddHBand="0" w:evenHBand="0" w:firstRowFirstColumn="0" w:firstRowLastColumn="0" w:lastRowFirstColumn="0" w:lastRowLastColumn="0"/>
-            </w:pPr>
             <w:r>
               <w:t>A*</w:t>
             </w:r>
@@ -3491,10 +3370,6 @@
             </w:tcBorders>
           </w:tcPr>
           <w:p>
-            <w:pPr>
-              <w:pStyle w:val="tablecopy"/>
-              <w:cnfStyle w:val="000000000000" w:firstRow="0" w:lastRow="0" w:firstColumn="0" w:lastColumn="0" w:oddVBand="0" w:evenVBand="0" w:oddHBand="0" w:evenHBand="0" w:firstRowFirstColumn="0" w:firstRowLastColumn="0" w:lastRowFirstColumn="0" w:lastRowLastColumn="0"/>
-            </w:pPr>
             <w:r>
               <w:t>100%</w:t>
             </w:r>
@@ -3509,30 +3384,22 @@
             </w:tcBorders>
           </w:tcPr>
           <w:p>
-            <w:pPr>
-              <w:pStyle w:val="tablecopy"/>
-              <w:cnfStyle w:val="000000000000" w:firstRow="0" w:lastRow="0" w:firstColumn="0" w:lastColumn="0" w:oddVBand="0" w:evenVBand="0" w:oddHBand="0" w:evenHBand="0" w:firstRowFirstColumn="0" w:firstRowLastColumn="0" w:lastRowFirstColumn="0" w:lastRowLastColumn="0"/>
-            </w:pPr>
-            <w:r>
-              <w:t>54.82</w:t>
-            </w:r>
-          </w:p>
-        </w:tc>
-        <w:tc>
-          <w:tcPr>
-            <w:tcW w:w="0" w:type="auto"/>
-            <w:tcBorders>
-              <w:top w:val="nil"/>
-              <w:bottom w:val="nil"/>
-            </w:tcBorders>
-          </w:tcPr>
-          <w:p>
-            <w:pPr>
-              <w:pStyle w:val="tablecopy"/>
-              <w:cnfStyle w:val="000000000000" w:firstRow="0" w:lastRow="0" w:firstColumn="0" w:lastColumn="0" w:oddVBand="0" w:evenVBand="0" w:oddHBand="0" w:evenHBand="0" w:firstRowFirstColumn="0" w:firstRowLastColumn="0" w:lastRowFirstColumn="0" w:lastRowLastColumn="0"/>
-            </w:pPr>
-            <w:r>
-              <w:t>31.4</w:t>
+            <w:r>
+              <w:t>54.74</w:t>
+            </w:r>
+          </w:p>
+        </w:tc>
+        <w:tc>
+          <w:tcPr>
+            <w:tcW w:w="0" w:type="auto"/>
+            <w:tcBorders>
+              <w:top w:val="nil"/>
+              <w:bottom w:val="nil"/>
+            </w:tcBorders>
+          </w:tcPr>
+          <w:p>
+            <w:r>
+              <w:t>38.0</w:t>
             </w:r>
           </w:p>
         </w:tc>
@@ -3552,18 +3419,7 @@
             </w:tcBorders>
           </w:tcPr>
           <w:p>
-            <w:pPr>
-              <w:pStyle w:val="tablecopy"/>
-              <w:rPr>
-                <w:b w:val="0"/>
-                <w:bCs w:val="0"/>
-              </w:rPr>
-            </w:pPr>
-            <w:r>
-              <w:rPr>
-                <w:b w:val="0"/>
-                <w:bCs w:val="0"/>
-              </w:rPr>
+            <w:r>
               <w:t>Mudah</w:t>
             </w:r>
           </w:p>
@@ -3577,10 +3433,6 @@
             </w:tcBorders>
           </w:tcPr>
           <w:p>
-            <w:pPr>
-              <w:pStyle w:val="tablecopy"/>
-              <w:cnfStyle w:val="000000100000" w:firstRow="0" w:lastRow="0" w:firstColumn="0" w:lastColumn="0" w:oddVBand="0" w:evenVBand="0" w:oddHBand="1" w:evenHBand="0" w:firstRowFirstColumn="0" w:firstRowLastColumn="0" w:lastRowFirstColumn="0" w:lastRowLastColumn="0"/>
-            </w:pPr>
             <w:r>
               <w:t>RRT*</w:t>
             </w:r>
@@ -3595,10 +3447,6 @@
             </w:tcBorders>
           </w:tcPr>
           <w:p>
-            <w:pPr>
-              <w:pStyle w:val="tablecopy"/>
-              <w:cnfStyle w:val="000000100000" w:firstRow="0" w:lastRow="0" w:firstColumn="0" w:lastColumn="0" w:oddVBand="0" w:evenVBand="0" w:oddHBand="1" w:evenHBand="0" w:firstRowFirstColumn="0" w:firstRowLastColumn="0" w:lastRowFirstColumn="0" w:lastRowLastColumn="0"/>
-            </w:pPr>
             <w:r>
               <w:t>100%</w:t>
             </w:r>
@@ -3613,30 +3461,22 @@
             </w:tcBorders>
           </w:tcPr>
           <w:p>
-            <w:pPr>
-              <w:pStyle w:val="tablecopy"/>
-              <w:cnfStyle w:val="000000100000" w:firstRow="0" w:lastRow="0" w:firstColumn="0" w:lastColumn="0" w:oddVBand="0" w:evenVBand="0" w:oddHBand="1" w:evenHBand="0" w:firstRowFirstColumn="0" w:firstRowLastColumn="0" w:lastRowFirstColumn="0" w:lastRowLastColumn="0"/>
-            </w:pPr>
-            <w:r>
-              <w:t>57.25</w:t>
-            </w:r>
-          </w:p>
-        </w:tc>
-        <w:tc>
-          <w:tcPr>
-            <w:tcW w:w="0" w:type="auto"/>
-            <w:tcBorders>
-              <w:top w:val="nil"/>
-              <w:bottom w:val="nil"/>
-            </w:tcBorders>
-          </w:tcPr>
-          <w:p>
-            <w:pPr>
-              <w:pStyle w:val="tablecopy"/>
-              <w:cnfStyle w:val="000000100000" w:firstRow="0" w:lastRow="0" w:firstColumn="0" w:lastColumn="0" w:oddVBand="0" w:evenVBand="0" w:oddHBand="1" w:evenHBand="0" w:firstRowFirstColumn="0" w:firstRowLastColumn="0" w:lastRowFirstColumn="0" w:lastRowLastColumn="0"/>
-            </w:pPr>
-            <w:r>
-              <w:t>197.9</w:t>
+            <w:r>
+              <w:t>57.35</w:t>
+            </w:r>
+          </w:p>
+        </w:tc>
+        <w:tc>
+          <w:tcPr>
+            <w:tcW w:w="0" w:type="auto"/>
+            <w:tcBorders>
+              <w:top w:val="nil"/>
+              <w:bottom w:val="nil"/>
+            </w:tcBorders>
+          </w:tcPr>
+          <w:p>
+            <w:r>
+              <w:t>302.5</w:t>
             </w:r>
           </w:p>
         </w:tc>
@@ -3655,18 +3495,7 @@
             </w:tcBorders>
           </w:tcPr>
           <w:p>
-            <w:pPr>
-              <w:pStyle w:val="tablecopy"/>
-              <w:rPr>
-                <w:b w:val="0"/>
-                <w:bCs w:val="0"/>
-              </w:rPr>
-            </w:pPr>
-            <w:r>
-              <w:rPr>
-                <w:b w:val="0"/>
-                <w:bCs w:val="0"/>
-              </w:rPr>
+            <w:r>
               <w:t>Sedang</w:t>
             </w:r>
           </w:p>
@@ -3680,10 +3509,6 @@
             </w:tcBorders>
           </w:tcPr>
           <w:p>
-            <w:pPr>
-              <w:pStyle w:val="tablecopy"/>
-              <w:cnfStyle w:val="000000000000" w:firstRow="0" w:lastRow="0" w:firstColumn="0" w:lastColumn="0" w:oddVBand="0" w:evenVBand="0" w:oddHBand="0" w:evenHBand="0" w:firstRowFirstColumn="0" w:firstRowLastColumn="0" w:lastRowFirstColumn="0" w:lastRowLastColumn="0"/>
-            </w:pPr>
             <w:r>
               <w:t>Brute Force</w:t>
             </w:r>
@@ -3698,10 +3523,6 @@
             </w:tcBorders>
           </w:tcPr>
           <w:p>
-            <w:pPr>
-              <w:pStyle w:val="tablecopy"/>
-              <w:cnfStyle w:val="000000000000" w:firstRow="0" w:lastRow="0" w:firstColumn="0" w:lastColumn="0" w:oddVBand="0" w:evenVBand="0" w:oddHBand="0" w:evenHBand="0" w:firstRowFirstColumn="0" w:firstRowLastColumn="0" w:lastRowFirstColumn="0" w:lastRowLastColumn="0"/>
-            </w:pPr>
             <w:r>
               <w:t>80%</w:t>
             </w:r>
@@ -3716,30 +3537,22 @@
             </w:tcBorders>
           </w:tcPr>
           <w:p>
-            <w:pPr>
-              <w:pStyle w:val="tablecopy"/>
-              <w:cnfStyle w:val="000000000000" w:firstRow="0" w:lastRow="0" w:firstColumn="0" w:lastColumn="0" w:oddVBand="0" w:evenVBand="0" w:oddHBand="0" w:evenHBand="0" w:firstRowFirstColumn="0" w:firstRowLastColumn="0" w:lastRowFirstColumn="0" w:lastRowLastColumn="0"/>
-            </w:pPr>
-            <w:r>
-              <w:t>53.16</w:t>
-            </w:r>
-          </w:p>
-        </w:tc>
-        <w:tc>
-          <w:tcPr>
-            <w:tcW w:w="0" w:type="auto"/>
-            <w:tcBorders>
-              <w:top w:val="nil"/>
-              <w:bottom w:val="nil"/>
-            </w:tcBorders>
-          </w:tcPr>
-          <w:p>
-            <w:pPr>
-              <w:pStyle w:val="tablecopy"/>
-              <w:cnfStyle w:val="000000000000" w:firstRow="0" w:lastRow="0" w:firstColumn="0" w:lastColumn="0" w:oddVBand="0" w:evenVBand="0" w:oddHBand="0" w:evenHBand="0" w:firstRowFirstColumn="0" w:firstRowLastColumn="0" w:lastRowFirstColumn="0" w:lastRowLastColumn="0"/>
-            </w:pPr>
-            <w:r>
-              <w:t>128.8</w:t>
+            <w:r>
+              <w:t>55.70</w:t>
+            </w:r>
+          </w:p>
+        </w:tc>
+        <w:tc>
+          <w:tcPr>
+            <w:tcW w:w="0" w:type="auto"/>
+            <w:tcBorders>
+              <w:top w:val="nil"/>
+              <w:bottom w:val="nil"/>
+            </w:tcBorders>
+          </w:tcPr>
+          <w:p>
+            <w:r>
+              <w:t>168.1</w:t>
             </w:r>
           </w:p>
         </w:tc>
@@ -3759,18 +3572,7 @@
             </w:tcBorders>
           </w:tcPr>
           <w:p>
-            <w:pPr>
-              <w:pStyle w:val="tablecopy"/>
-              <w:rPr>
-                <w:b w:val="0"/>
-                <w:bCs w:val="0"/>
-              </w:rPr>
-            </w:pPr>
-            <w:r>
-              <w:rPr>
-                <w:b w:val="0"/>
-                <w:bCs w:val="0"/>
-              </w:rPr>
+            <w:r>
               <w:t>Sedang</w:t>
             </w:r>
           </w:p>
@@ -3784,10 +3586,6 @@
             </w:tcBorders>
           </w:tcPr>
           <w:p>
-            <w:pPr>
-              <w:pStyle w:val="tablecopy"/>
-              <w:cnfStyle w:val="000000100000" w:firstRow="0" w:lastRow="0" w:firstColumn="0" w:lastColumn="0" w:oddVBand="0" w:evenVBand="0" w:oddHBand="1" w:evenHBand="0" w:firstRowFirstColumn="0" w:firstRowLastColumn="0" w:lastRowFirstColumn="0" w:lastRowLastColumn="0"/>
-            </w:pPr>
             <w:r>
               <w:t>UCS</w:t>
             </w:r>
@@ -3802,10 +3600,6 @@
             </w:tcBorders>
           </w:tcPr>
           <w:p>
-            <w:pPr>
-              <w:pStyle w:val="tablecopy"/>
-              <w:cnfStyle w:val="000000100000" w:firstRow="0" w:lastRow="0" w:firstColumn="0" w:lastColumn="0" w:oddVBand="0" w:evenVBand="0" w:oddHBand="1" w:evenHBand="0" w:firstRowFirstColumn="0" w:firstRowLastColumn="0" w:lastRowFirstColumn="0" w:lastRowLastColumn="0"/>
-            </w:pPr>
             <w:r>
               <w:t>100%</w:t>
             </w:r>
@@ -3820,30 +3614,22 @@
             </w:tcBorders>
           </w:tcPr>
           <w:p>
-            <w:pPr>
-              <w:pStyle w:val="tablecopy"/>
-              <w:cnfStyle w:val="000000100000" w:firstRow="0" w:lastRow="0" w:firstColumn="0" w:lastColumn="0" w:oddVBand="0" w:evenVBand="0" w:oddHBand="1" w:evenHBand="0" w:firstRowFirstColumn="0" w:firstRowLastColumn="0" w:lastRowFirstColumn="0" w:lastRowLastColumn="0"/>
-            </w:pPr>
-            <w:r>
-              <w:t>54.49</w:t>
-            </w:r>
-          </w:p>
-        </w:tc>
-        <w:tc>
-          <w:tcPr>
-            <w:tcW w:w="0" w:type="auto"/>
-            <w:tcBorders>
-              <w:top w:val="nil"/>
-              <w:bottom w:val="nil"/>
-            </w:tcBorders>
-          </w:tcPr>
-          <w:p>
-            <w:pPr>
-              <w:pStyle w:val="tablecopy"/>
-              <w:cnfStyle w:val="000000100000" w:firstRow="0" w:lastRow="0" w:firstColumn="0" w:lastColumn="0" w:oddVBand="0" w:evenVBand="0" w:oddHBand="1" w:evenHBand="0" w:firstRowFirstColumn="0" w:firstRowLastColumn="0" w:lastRowFirstColumn="0" w:lastRowLastColumn="0"/>
-            </w:pPr>
-            <w:r>
-              <w:t>413.5</w:t>
+            <w:r>
+              <w:t>55.40</w:t>
+            </w:r>
+          </w:p>
+        </w:tc>
+        <w:tc>
+          <w:tcPr>
+            <w:tcW w:w="0" w:type="auto"/>
+            <w:tcBorders>
+              <w:top w:val="nil"/>
+              <w:bottom w:val="nil"/>
+            </w:tcBorders>
+          </w:tcPr>
+          <w:p>
+            <w:r>
+              <w:t>540.1</w:t>
             </w:r>
           </w:p>
         </w:tc>
@@ -3862,18 +3648,7 @@
             </w:tcBorders>
           </w:tcPr>
           <w:p>
-            <w:pPr>
-              <w:pStyle w:val="tablecopy"/>
-              <w:rPr>
-                <w:b w:val="0"/>
-                <w:bCs w:val="0"/>
-              </w:rPr>
-            </w:pPr>
-            <w:r>
-              <w:rPr>
-                <w:b w:val="0"/>
-                <w:bCs w:val="0"/>
-              </w:rPr>
+            <w:r>
               <w:t>Sedang</w:t>
             </w:r>
           </w:p>
@@ -3887,10 +3662,6 @@
             </w:tcBorders>
           </w:tcPr>
           <w:p>
-            <w:pPr>
-              <w:pStyle w:val="tablecopy"/>
-              <w:cnfStyle w:val="000000000000" w:firstRow="0" w:lastRow="0" w:firstColumn="0" w:lastColumn="0" w:oddVBand="0" w:evenVBand="0" w:oddHBand="0" w:evenHBand="0" w:firstRowFirstColumn="0" w:firstRowLastColumn="0" w:lastRowFirstColumn="0" w:lastRowLastColumn="0"/>
-            </w:pPr>
             <w:r>
               <w:t>GBFS</w:t>
             </w:r>
@@ -3905,10 +3676,6 @@
             </w:tcBorders>
           </w:tcPr>
           <w:p>
-            <w:pPr>
-              <w:pStyle w:val="tablecopy"/>
-              <w:cnfStyle w:val="000000000000" w:firstRow="0" w:lastRow="0" w:firstColumn="0" w:lastColumn="0" w:oddVBand="0" w:evenVBand="0" w:oddHBand="0" w:evenHBand="0" w:firstRowFirstColumn="0" w:firstRowLastColumn="0" w:lastRowFirstColumn="0" w:lastRowLastColumn="0"/>
-            </w:pPr>
             <w:r>
               <w:t>100%</w:t>
             </w:r>
@@ -3923,30 +3690,22 @@
             </w:tcBorders>
           </w:tcPr>
           <w:p>
-            <w:pPr>
-              <w:pStyle w:val="tablecopy"/>
-              <w:cnfStyle w:val="000000000000" w:firstRow="0" w:lastRow="0" w:firstColumn="0" w:lastColumn="0" w:oddVBand="0" w:evenVBand="0" w:oddHBand="0" w:evenHBand="0" w:firstRowFirstColumn="0" w:firstRowLastColumn="0" w:lastRowFirstColumn="0" w:lastRowLastColumn="0"/>
-            </w:pPr>
-            <w:r>
-              <w:t>55.44</w:t>
-            </w:r>
-          </w:p>
-        </w:tc>
-        <w:tc>
-          <w:tcPr>
-            <w:tcW w:w="0" w:type="auto"/>
-            <w:tcBorders>
-              <w:top w:val="nil"/>
-              <w:bottom w:val="nil"/>
-            </w:tcBorders>
-          </w:tcPr>
-          <w:p>
-            <w:pPr>
-              <w:pStyle w:val="tablecopy"/>
-              <w:cnfStyle w:val="000000000000" w:firstRow="0" w:lastRow="0" w:firstColumn="0" w:lastColumn="0" w:oddVBand="0" w:evenVBand="0" w:oddHBand="0" w:evenHBand="0" w:firstRowFirstColumn="0" w:firstRowLastColumn="0" w:lastRowFirstColumn="0" w:lastRowLastColumn="0"/>
-            </w:pPr>
-            <w:r>
-              <w:t>11.1</w:t>
+            <w:r>
+              <w:t>56.38</w:t>
+            </w:r>
+          </w:p>
+        </w:tc>
+        <w:tc>
+          <w:tcPr>
+            <w:tcW w:w="0" w:type="auto"/>
+            <w:tcBorders>
+              <w:top w:val="nil"/>
+              <w:bottom w:val="nil"/>
+            </w:tcBorders>
+          </w:tcPr>
+          <w:p>
+            <w:r>
+              <w:t>18.7</w:t>
             </w:r>
           </w:p>
         </w:tc>
@@ -3966,18 +3725,7 @@
             </w:tcBorders>
           </w:tcPr>
           <w:p>
-            <w:pPr>
-              <w:pStyle w:val="tablecopy"/>
-              <w:rPr>
-                <w:b w:val="0"/>
-                <w:bCs w:val="0"/>
-              </w:rPr>
-            </w:pPr>
-            <w:r>
-              <w:rPr>
-                <w:b w:val="0"/>
-                <w:bCs w:val="0"/>
-              </w:rPr>
+            <w:r>
               <w:t>Sedang</w:t>
             </w:r>
           </w:p>
@@ -3991,10 +3739,6 @@
             </w:tcBorders>
           </w:tcPr>
           <w:p>
-            <w:pPr>
-              <w:pStyle w:val="tablecopy"/>
-              <w:cnfStyle w:val="000000100000" w:firstRow="0" w:lastRow="0" w:firstColumn="0" w:lastColumn="0" w:oddVBand="0" w:evenVBand="0" w:oddHBand="1" w:evenHBand="0" w:firstRowFirstColumn="0" w:firstRowLastColumn="0" w:lastRowFirstColumn="0" w:lastRowLastColumn="0"/>
-            </w:pPr>
             <w:r>
               <w:t>A*</w:t>
             </w:r>
@@ -4009,10 +3753,6 @@
             </w:tcBorders>
           </w:tcPr>
           <w:p>
-            <w:pPr>
-              <w:pStyle w:val="tablecopy"/>
-              <w:cnfStyle w:val="000000100000" w:firstRow="0" w:lastRow="0" w:firstColumn="0" w:lastColumn="0" w:oddVBand="0" w:evenVBand="0" w:oddHBand="1" w:evenHBand="0" w:firstRowFirstColumn="0" w:firstRowLastColumn="0" w:lastRowFirstColumn="0" w:lastRowLastColumn="0"/>
-            </w:pPr>
             <w:r>
               <w:t>100%</w:t>
             </w:r>
@@ -4027,30 +3767,22 @@
             </w:tcBorders>
           </w:tcPr>
           <w:p>
-            <w:pPr>
-              <w:pStyle w:val="tablecopy"/>
-              <w:cnfStyle w:val="000000100000" w:firstRow="0" w:lastRow="0" w:firstColumn="0" w:lastColumn="0" w:oddVBand="0" w:evenVBand="0" w:oddHBand="1" w:evenHBand="0" w:firstRowFirstColumn="0" w:firstRowLastColumn="0" w:lastRowFirstColumn="0" w:lastRowLastColumn="0"/>
-            </w:pPr>
-            <w:r>
-              <w:t>54.49</w:t>
-            </w:r>
-          </w:p>
-        </w:tc>
-        <w:tc>
-          <w:tcPr>
-            <w:tcW w:w="0" w:type="auto"/>
-            <w:tcBorders>
-              <w:top w:val="nil"/>
-              <w:bottom w:val="nil"/>
-            </w:tcBorders>
-          </w:tcPr>
-          <w:p>
-            <w:pPr>
-              <w:pStyle w:val="tablecopy"/>
-              <w:cnfStyle w:val="000000100000" w:firstRow="0" w:lastRow="0" w:firstColumn="0" w:lastColumn="0" w:oddVBand="0" w:evenVBand="0" w:oddHBand="1" w:evenHBand="0" w:firstRowFirstColumn="0" w:firstRowLastColumn="0" w:lastRowFirstColumn="0" w:lastRowLastColumn="0"/>
-            </w:pPr>
-            <w:r>
-              <w:t>46.9</w:t>
+            <w:r>
+              <w:t>55.40</w:t>
+            </w:r>
+          </w:p>
+        </w:tc>
+        <w:tc>
+          <w:tcPr>
+            <w:tcW w:w="0" w:type="auto"/>
+            <w:tcBorders>
+              <w:top w:val="nil"/>
+              <w:bottom w:val="nil"/>
+            </w:tcBorders>
+          </w:tcPr>
+          <w:p>
+            <w:r>
+              <w:t>89.2</w:t>
             </w:r>
           </w:p>
         </w:tc>
@@ -4069,18 +3801,7 @@
             </w:tcBorders>
           </w:tcPr>
           <w:p>
-            <w:pPr>
-              <w:pStyle w:val="tablecopy"/>
-              <w:rPr>
-                <w:b w:val="0"/>
-                <w:bCs w:val="0"/>
-              </w:rPr>
-            </w:pPr>
-            <w:r>
-              <w:rPr>
-                <w:b w:val="0"/>
-                <w:bCs w:val="0"/>
-              </w:rPr>
+            <w:r>
               <w:t>Sedang</w:t>
             </w:r>
           </w:p>
@@ -4094,10 +3815,6 @@
             </w:tcBorders>
           </w:tcPr>
           <w:p>
-            <w:pPr>
-              <w:pStyle w:val="tablecopy"/>
-              <w:cnfStyle w:val="000000000000" w:firstRow="0" w:lastRow="0" w:firstColumn="0" w:lastColumn="0" w:oddVBand="0" w:evenVBand="0" w:oddHBand="0" w:evenHBand="0" w:firstRowFirstColumn="0" w:firstRowLastColumn="0" w:lastRowFirstColumn="0" w:lastRowLastColumn="0"/>
-            </w:pPr>
             <w:r>
               <w:t>RRT*</w:t>
             </w:r>
@@ -4112,10 +3829,6 @@
             </w:tcBorders>
           </w:tcPr>
           <w:p>
-            <w:pPr>
-              <w:pStyle w:val="tablecopy"/>
-              <w:cnfStyle w:val="000000000000" w:firstRow="0" w:lastRow="0" w:firstColumn="0" w:lastColumn="0" w:oddVBand="0" w:evenVBand="0" w:oddHBand="0" w:evenHBand="0" w:firstRowFirstColumn="0" w:firstRowLastColumn="0" w:lastRowFirstColumn="0" w:lastRowLastColumn="0"/>
-            </w:pPr>
             <w:r>
               <w:t>100%</w:t>
             </w:r>
@@ -4130,30 +3843,22 @@
             </w:tcBorders>
           </w:tcPr>
           <w:p>
-            <w:pPr>
-              <w:pStyle w:val="tablecopy"/>
-              <w:cnfStyle w:val="000000000000" w:firstRow="0" w:lastRow="0" w:firstColumn="0" w:lastColumn="0" w:oddVBand="0" w:evenVBand="0" w:oddHBand="0" w:evenHBand="0" w:firstRowFirstColumn="0" w:firstRowLastColumn="0" w:lastRowFirstColumn="0" w:lastRowLastColumn="0"/>
-            </w:pPr>
-            <w:r>
-              <w:t>56.34</w:t>
-            </w:r>
-          </w:p>
-        </w:tc>
-        <w:tc>
-          <w:tcPr>
-            <w:tcW w:w="0" w:type="auto"/>
-            <w:tcBorders>
-              <w:top w:val="nil"/>
-              <w:bottom w:val="nil"/>
-            </w:tcBorders>
-          </w:tcPr>
-          <w:p>
-            <w:pPr>
-              <w:pStyle w:val="tablecopy"/>
-              <w:cnfStyle w:val="000000000000" w:firstRow="0" w:lastRow="0" w:firstColumn="0" w:lastColumn="0" w:oddVBand="0" w:evenVBand="0" w:oddHBand="0" w:evenHBand="0" w:firstRowFirstColumn="0" w:firstRowLastColumn="0" w:lastRowFirstColumn="0" w:lastRowLastColumn="0"/>
-            </w:pPr>
-            <w:r>
-              <w:t>288.8</w:t>
+            <w:r>
+              <w:t>57.35</w:t>
+            </w:r>
+          </w:p>
+        </w:tc>
+        <w:tc>
+          <w:tcPr>
+            <w:tcW w:w="0" w:type="auto"/>
+            <w:tcBorders>
+              <w:top w:val="nil"/>
+              <w:bottom w:val="nil"/>
+            </w:tcBorders>
+          </w:tcPr>
+          <w:p>
+            <w:r>
+              <w:t>469.9</w:t>
             </w:r>
           </w:p>
         </w:tc>
@@ -4173,18 +3878,7 @@
             </w:tcBorders>
           </w:tcPr>
           <w:p>
-            <w:pPr>
-              <w:pStyle w:val="tablecopy"/>
-              <w:rPr>
-                <w:b w:val="0"/>
-                <w:bCs w:val="0"/>
-              </w:rPr>
-            </w:pPr>
-            <w:r>
-              <w:rPr>
-                <w:b w:val="0"/>
-                <w:bCs w:val="0"/>
-              </w:rPr>
+            <w:r>
               <w:t>Sulit</w:t>
             </w:r>
           </w:p>
@@ -4198,10 +3892,6 @@
             </w:tcBorders>
           </w:tcPr>
           <w:p>
-            <w:pPr>
-              <w:pStyle w:val="tablecopy"/>
-              <w:cnfStyle w:val="000000100000" w:firstRow="0" w:lastRow="0" w:firstColumn="0" w:lastColumn="0" w:oddVBand="0" w:evenVBand="0" w:oddHBand="1" w:evenHBand="0" w:firstRowFirstColumn="0" w:firstRowLastColumn="0" w:lastRowFirstColumn="0" w:lastRowLastColumn="0"/>
-            </w:pPr>
             <w:r>
               <w:t>Brute Force</w:t>
             </w:r>
@@ -4216,10 +3906,6 @@
             </w:tcBorders>
           </w:tcPr>
           <w:p>
-            <w:pPr>
-              <w:pStyle w:val="tablecopy"/>
-              <w:cnfStyle w:val="000000100000" w:firstRow="0" w:lastRow="0" w:firstColumn="0" w:lastColumn="0" w:oddVBand="0" w:evenVBand="0" w:oddHBand="1" w:evenHBand="0" w:firstRowFirstColumn="0" w:firstRowLastColumn="0" w:lastRowFirstColumn="0" w:lastRowLastColumn="0"/>
-            </w:pPr>
             <w:r>
               <w:t>20%</w:t>
             </w:r>
@@ -4234,30 +3920,22 @@
             </w:tcBorders>
           </w:tcPr>
           <w:p>
-            <w:pPr>
-              <w:pStyle w:val="tablecopy"/>
-              <w:cnfStyle w:val="000000100000" w:firstRow="0" w:lastRow="0" w:firstColumn="0" w:lastColumn="0" w:oddVBand="0" w:evenVBand="0" w:oddHBand="1" w:evenHBand="0" w:firstRowFirstColumn="0" w:firstRowLastColumn="0" w:lastRowFirstColumn="0" w:lastRowLastColumn="0"/>
-            </w:pPr>
-            <w:r>
-              <w:t>66.13</w:t>
-            </w:r>
-          </w:p>
-        </w:tc>
-        <w:tc>
-          <w:tcPr>
-            <w:tcW w:w="0" w:type="auto"/>
-            <w:tcBorders>
-              <w:top w:val="nil"/>
-              <w:bottom w:val="nil"/>
-            </w:tcBorders>
-          </w:tcPr>
-          <w:p>
-            <w:pPr>
-              <w:pStyle w:val="tablecopy"/>
-              <w:cnfStyle w:val="000000100000" w:firstRow="0" w:lastRow="0" w:firstColumn="0" w:lastColumn="0" w:oddVBand="0" w:evenVBand="0" w:oddHBand="1" w:evenHBand="0" w:firstRowFirstColumn="0" w:firstRowLastColumn="0" w:lastRowFirstColumn="0" w:lastRowLastColumn="0"/>
-            </w:pPr>
-            <w:r>
-              <w:t>94.6</w:t>
+            <w:r>
+              <w:t>65.37</w:t>
+            </w:r>
+          </w:p>
+        </w:tc>
+        <w:tc>
+          <w:tcPr>
+            <w:tcW w:w="0" w:type="auto"/>
+            <w:tcBorders>
+              <w:top w:val="nil"/>
+              <w:bottom w:val="nil"/>
+            </w:tcBorders>
+          </w:tcPr>
+          <w:p>
+            <w:r>
+              <w:t>108.9</w:t>
             </w:r>
           </w:p>
         </w:tc>
@@ -4276,18 +3954,7 @@
             </w:tcBorders>
           </w:tcPr>
           <w:p>
-            <w:pPr>
-              <w:pStyle w:val="tablecopy"/>
-              <w:rPr>
-                <w:b w:val="0"/>
-                <w:bCs w:val="0"/>
-              </w:rPr>
-            </w:pPr>
-            <w:r>
-              <w:rPr>
-                <w:b w:val="0"/>
-                <w:bCs w:val="0"/>
-              </w:rPr>
+            <w:r>
               <w:t>Sulit</w:t>
             </w:r>
           </w:p>
@@ -4301,10 +3968,6 @@
             </w:tcBorders>
           </w:tcPr>
           <w:p>
-            <w:pPr>
-              <w:pStyle w:val="tablecopy"/>
-              <w:cnfStyle w:val="000000000000" w:firstRow="0" w:lastRow="0" w:firstColumn="0" w:lastColumn="0" w:oddVBand="0" w:evenVBand="0" w:oddHBand="0" w:evenHBand="0" w:firstRowFirstColumn="0" w:firstRowLastColumn="0" w:lastRowFirstColumn="0" w:lastRowLastColumn="0"/>
-            </w:pPr>
             <w:r>
               <w:t>UCS</w:t>
             </w:r>
@@ -4319,10 +3982,6 @@
             </w:tcBorders>
           </w:tcPr>
           <w:p>
-            <w:pPr>
-              <w:pStyle w:val="tablecopy"/>
-              <w:cnfStyle w:val="000000000000" w:firstRow="0" w:lastRow="0" w:firstColumn="0" w:lastColumn="0" w:oddVBand="0" w:evenVBand="0" w:oddHBand="0" w:evenHBand="0" w:firstRowFirstColumn="0" w:firstRowLastColumn="0" w:lastRowFirstColumn="0" w:lastRowLastColumn="0"/>
-            </w:pPr>
             <w:r>
               <w:t>100%</w:t>
             </w:r>
@@ -4337,30 +3996,22 @@
             </w:tcBorders>
           </w:tcPr>
           <w:p>
-            <w:pPr>
-              <w:pStyle w:val="tablecopy"/>
-              <w:cnfStyle w:val="000000000000" w:firstRow="0" w:lastRow="0" w:firstColumn="0" w:lastColumn="0" w:oddVBand="0" w:evenVBand="0" w:oddHBand="0" w:evenHBand="0" w:firstRowFirstColumn="0" w:firstRowLastColumn="0" w:lastRowFirstColumn="0" w:lastRowLastColumn="0"/>
-            </w:pPr>
-            <w:r>
-              <w:t>70.76</w:t>
-            </w:r>
-          </w:p>
-        </w:tc>
-        <w:tc>
-          <w:tcPr>
-            <w:tcW w:w="0" w:type="auto"/>
-            <w:tcBorders>
-              <w:top w:val="nil"/>
-              <w:bottom w:val="nil"/>
-            </w:tcBorders>
-          </w:tcPr>
-          <w:p>
-            <w:pPr>
-              <w:pStyle w:val="tablecopy"/>
-              <w:cnfStyle w:val="000000000000" w:firstRow="0" w:lastRow="0" w:firstColumn="0" w:lastColumn="0" w:oddVBand="0" w:evenVBand="0" w:oddHBand="0" w:evenHBand="0" w:firstRowFirstColumn="0" w:firstRowLastColumn="0" w:lastRowFirstColumn="0" w:lastRowLastColumn="0"/>
-            </w:pPr>
-            <w:r>
-              <w:t>342.2</w:t>
+            <w:r>
+              <w:t>70.35</w:t>
+            </w:r>
+          </w:p>
+        </w:tc>
+        <w:tc>
+          <w:tcPr>
+            <w:tcW w:w="0" w:type="auto"/>
+            <w:tcBorders>
+              <w:top w:val="nil"/>
+              <w:bottom w:val="nil"/>
+            </w:tcBorders>
+          </w:tcPr>
+          <w:p>
+            <w:r>
+              <w:t>433.9</w:t>
             </w:r>
           </w:p>
         </w:tc>
@@ -4380,18 +4031,7 @@
             </w:tcBorders>
           </w:tcPr>
           <w:p>
-            <w:pPr>
-              <w:pStyle w:val="tablecopy"/>
-              <w:rPr>
-                <w:b w:val="0"/>
-                <w:bCs w:val="0"/>
-              </w:rPr>
-            </w:pPr>
-            <w:r>
-              <w:rPr>
-                <w:b w:val="0"/>
-                <w:bCs w:val="0"/>
-              </w:rPr>
+            <w:r>
               <w:t>Sulit</w:t>
             </w:r>
           </w:p>
@@ -4405,10 +4045,6 @@
             </w:tcBorders>
           </w:tcPr>
           <w:p>
-            <w:pPr>
-              <w:pStyle w:val="tablecopy"/>
-              <w:cnfStyle w:val="000000100000" w:firstRow="0" w:lastRow="0" w:firstColumn="0" w:lastColumn="0" w:oddVBand="0" w:evenVBand="0" w:oddHBand="1" w:evenHBand="0" w:firstRowFirstColumn="0" w:firstRowLastColumn="0" w:lastRowFirstColumn="0" w:lastRowLastColumn="0"/>
-            </w:pPr>
             <w:r>
               <w:t>GBFS</w:t>
             </w:r>
@@ -4423,10 +4059,6 @@
             </w:tcBorders>
           </w:tcPr>
           <w:p>
-            <w:pPr>
-              <w:pStyle w:val="tablecopy"/>
-              <w:cnfStyle w:val="000000100000" w:firstRow="0" w:lastRow="0" w:firstColumn="0" w:lastColumn="0" w:oddVBand="0" w:evenVBand="0" w:oddHBand="1" w:evenHBand="0" w:firstRowFirstColumn="0" w:firstRowLastColumn="0" w:lastRowFirstColumn="0" w:lastRowLastColumn="0"/>
-            </w:pPr>
             <w:r>
               <w:t>100%</w:t>
             </w:r>
@@ -4441,10 +4073,6 @@
             </w:tcBorders>
           </w:tcPr>
           <w:p>
-            <w:pPr>
-              <w:pStyle w:val="tablecopy"/>
-              <w:cnfStyle w:val="000000100000" w:firstRow="0" w:lastRow="0" w:firstColumn="0" w:lastColumn="0" w:oddVBand="0" w:evenVBand="0" w:oddHBand="1" w:evenHBand="0" w:firstRowFirstColumn="0" w:firstRowLastColumn="0" w:lastRowFirstColumn="0" w:lastRowLastColumn="0"/>
-            </w:pPr>
             <w:r>
               <w:t>75.88</w:t>
             </w:r>
@@ -4459,12 +4087,8 @@
             </w:tcBorders>
           </w:tcPr>
           <w:p>
-            <w:pPr>
-              <w:pStyle w:val="tablecopy"/>
-              <w:cnfStyle w:val="000000100000" w:firstRow="0" w:lastRow="0" w:firstColumn="0" w:lastColumn="0" w:oddVBand="0" w:evenVBand="0" w:oddHBand="1" w:evenHBand="0" w:firstRowFirstColumn="0" w:firstRowLastColumn="0" w:lastRowFirstColumn="0" w:lastRowLastColumn="0"/>
-            </w:pPr>
-            <w:r>
-              <w:t>33.8</w:t>
+            <w:r>
+              <w:t>29.1</w:t>
             </w:r>
           </w:p>
         </w:tc>
@@ -4483,18 +4107,7 @@
             </w:tcBorders>
           </w:tcPr>
           <w:p>
-            <w:pPr>
-              <w:pStyle w:val="tablecopy"/>
-              <w:rPr>
-                <w:b w:val="0"/>
-                <w:bCs w:val="0"/>
-              </w:rPr>
-            </w:pPr>
-            <w:r>
-              <w:rPr>
-                <w:b w:val="0"/>
-                <w:bCs w:val="0"/>
-              </w:rPr>
+            <w:r>
               <w:t>Sulit</w:t>
             </w:r>
           </w:p>
@@ -4508,10 +4121,6 @@
             </w:tcBorders>
           </w:tcPr>
           <w:p>
-            <w:pPr>
-              <w:pStyle w:val="tablecopy"/>
-              <w:cnfStyle w:val="000000000000" w:firstRow="0" w:lastRow="0" w:firstColumn="0" w:lastColumn="0" w:oddVBand="0" w:evenVBand="0" w:oddHBand="0" w:evenHBand="0" w:firstRowFirstColumn="0" w:firstRowLastColumn="0" w:lastRowFirstColumn="0" w:lastRowLastColumn="0"/>
-            </w:pPr>
             <w:r>
               <w:t>A*</w:t>
             </w:r>
@@ -4526,10 +4135,6 @@
             </w:tcBorders>
           </w:tcPr>
           <w:p>
-            <w:pPr>
-              <w:pStyle w:val="tablecopy"/>
-              <w:cnfStyle w:val="000000000000" w:firstRow="0" w:lastRow="0" w:firstColumn="0" w:lastColumn="0" w:oddVBand="0" w:evenVBand="0" w:oddHBand="0" w:evenHBand="0" w:firstRowFirstColumn="0" w:firstRowLastColumn="0" w:lastRowFirstColumn="0" w:lastRowLastColumn="0"/>
-            </w:pPr>
             <w:r>
               <w:t>100%</w:t>
             </w:r>
@@ -4544,30 +4149,22 @@
             </w:tcBorders>
           </w:tcPr>
           <w:p>
-            <w:pPr>
-              <w:pStyle w:val="tablecopy"/>
-              <w:cnfStyle w:val="000000000000" w:firstRow="0" w:lastRow="0" w:firstColumn="0" w:lastColumn="0" w:oddVBand="0" w:evenVBand="0" w:oddHBand="0" w:evenHBand="0" w:firstRowFirstColumn="0" w:firstRowLastColumn="0" w:lastRowFirstColumn="0" w:lastRowLastColumn="0"/>
-            </w:pPr>
-            <w:r>
-              <w:t>70.76</w:t>
-            </w:r>
-          </w:p>
-        </w:tc>
-        <w:tc>
-          <w:tcPr>
-            <w:tcW w:w="0" w:type="auto"/>
-            <w:tcBorders>
-              <w:top w:val="nil"/>
-              <w:bottom w:val="nil"/>
-            </w:tcBorders>
-          </w:tcPr>
-          <w:p>
-            <w:pPr>
-              <w:pStyle w:val="tablecopy"/>
-              <w:cnfStyle w:val="000000000000" w:firstRow="0" w:lastRow="0" w:firstColumn="0" w:lastColumn="0" w:oddVBand="0" w:evenVBand="0" w:oddHBand="0" w:evenHBand="0" w:firstRowFirstColumn="0" w:firstRowLastColumn="0" w:lastRowFirstColumn="0" w:lastRowLastColumn="0"/>
-            </w:pPr>
-            <w:r>
-              <w:t>241.1</w:t>
+            <w:r>
+              <w:t>70.35</w:t>
+            </w:r>
+          </w:p>
+        </w:tc>
+        <w:tc>
+          <w:tcPr>
+            <w:tcW w:w="0" w:type="auto"/>
+            <w:tcBorders>
+              <w:top w:val="nil"/>
+              <w:bottom w:val="nil"/>
+            </w:tcBorders>
+          </w:tcPr>
+          <w:p>
+            <w:r>
+              <w:t>266.0</w:t>
             </w:r>
           </w:p>
         </w:tc>
@@ -4587,18 +4184,7 @@
             </w:tcBorders>
           </w:tcPr>
           <w:p>
-            <w:pPr>
-              <w:pStyle w:val="tablecopy"/>
-              <w:rPr>
-                <w:b w:val="0"/>
-                <w:bCs w:val="0"/>
-              </w:rPr>
-            </w:pPr>
-            <w:r>
-              <w:rPr>
-                <w:b w:val="0"/>
-                <w:bCs w:val="0"/>
-              </w:rPr>
+            <w:r>
               <w:t>Sulit</w:t>
             </w:r>
           </w:p>
@@ -4612,10 +4198,6 @@
             </w:tcBorders>
           </w:tcPr>
           <w:p>
-            <w:pPr>
-              <w:pStyle w:val="tablecopy"/>
-              <w:cnfStyle w:val="000000100000" w:firstRow="0" w:lastRow="0" w:firstColumn="0" w:lastColumn="0" w:oddVBand="0" w:evenVBand="0" w:oddHBand="1" w:evenHBand="0" w:firstRowFirstColumn="0" w:firstRowLastColumn="0" w:lastRowFirstColumn="0" w:lastRowLastColumn="0"/>
-            </w:pPr>
             <w:r>
               <w:t>RRT*</w:t>
             </w:r>
@@ -4630,48 +4212,36 @@
             </w:tcBorders>
           </w:tcPr>
           <w:p>
-            <w:pPr>
-              <w:pStyle w:val="tablecopy"/>
-              <w:cnfStyle w:val="000000100000" w:firstRow="0" w:lastRow="0" w:firstColumn="0" w:lastColumn="0" w:oddVBand="0" w:evenVBand="0" w:oddHBand="1" w:evenHBand="0" w:firstRowFirstColumn="0" w:firstRowLastColumn="0" w:lastRowFirstColumn="0" w:lastRowLastColumn="0"/>
-            </w:pPr>
-            <w:r>
-              <w:t>80%</w:t>
-            </w:r>
-          </w:p>
-        </w:tc>
-        <w:tc>
-          <w:tcPr>
-            <w:tcW w:w="0" w:type="auto"/>
-            <w:tcBorders>
-              <w:top w:val="nil"/>
-              <w:bottom w:val="nil"/>
-            </w:tcBorders>
-          </w:tcPr>
-          <w:p>
-            <w:pPr>
-              <w:pStyle w:val="tablecopy"/>
-              <w:cnfStyle w:val="000000100000" w:firstRow="0" w:lastRow="0" w:firstColumn="0" w:lastColumn="0" w:oddVBand="0" w:evenVBand="0" w:oddHBand="1" w:evenHBand="0" w:firstRowFirstColumn="0" w:firstRowLastColumn="0" w:lastRowFirstColumn="0" w:lastRowLastColumn="0"/>
-            </w:pPr>
-            <w:r>
-              <w:t>84.69</w:t>
-            </w:r>
-          </w:p>
-        </w:tc>
-        <w:tc>
-          <w:tcPr>
-            <w:tcW w:w="0" w:type="auto"/>
-            <w:tcBorders>
-              <w:top w:val="nil"/>
-              <w:bottom w:val="nil"/>
-            </w:tcBorders>
-          </w:tcPr>
-          <w:p>
-            <w:pPr>
-              <w:pStyle w:val="tablecopy"/>
-              <w:cnfStyle w:val="000000100000" w:firstRow="0" w:lastRow="0" w:firstColumn="0" w:lastColumn="0" w:oddVBand="0" w:evenVBand="0" w:oddHBand="1" w:evenHBand="0" w:firstRowFirstColumn="0" w:firstRowLastColumn="0" w:lastRowFirstColumn="0" w:lastRowLastColumn="0"/>
-            </w:pPr>
-            <w:r>
-              <w:t>125.4</w:t>
+            <w:r>
+              <w:t>90%</w:t>
+            </w:r>
+          </w:p>
+        </w:tc>
+        <w:tc>
+          <w:tcPr>
+            <w:tcW w:w="0" w:type="auto"/>
+            <w:tcBorders>
+              <w:top w:val="nil"/>
+              <w:bottom w:val="nil"/>
+            </w:tcBorders>
+          </w:tcPr>
+          <w:p>
+            <w:r>
+              <w:t>82.27</w:t>
+            </w:r>
+          </w:p>
+        </w:tc>
+        <w:tc>
+          <w:tcPr>
+            <w:tcW w:w="0" w:type="auto"/>
+            <w:tcBorders>
+              <w:top w:val="nil"/>
+              <w:bottom w:val="nil"/>
+            </w:tcBorders>
+          </w:tcPr>
+          <w:p>
+            <w:r>
+              <w:t>232.0</w:t>
             </w:r>
           </w:p>
         </w:tc>
@@ -4690,18 +4260,7 @@
             </w:tcBorders>
           </w:tcPr>
           <w:p>
-            <w:pPr>
-              <w:pStyle w:val="tablecopy"/>
-              <w:rPr>
-                <w:b w:val="0"/>
-                <w:bCs w:val="0"/>
-              </w:rPr>
-            </w:pPr>
-            <w:r>
-              <w:rPr>
-                <w:b w:val="0"/>
-                <w:bCs w:val="0"/>
-              </w:rPr>
+            <w:r>
               <w:t>Padat</w:t>
             </w:r>
           </w:p>
@@ -4715,10 +4274,6 @@
             </w:tcBorders>
           </w:tcPr>
           <w:p>
-            <w:pPr>
-              <w:pStyle w:val="tablecopy"/>
-              <w:cnfStyle w:val="000000000000" w:firstRow="0" w:lastRow="0" w:firstColumn="0" w:lastColumn="0" w:oddVBand="0" w:evenVBand="0" w:oddHBand="0" w:evenHBand="0" w:firstRowFirstColumn="0" w:firstRowLastColumn="0" w:lastRowFirstColumn="0" w:lastRowLastColumn="0"/>
-            </w:pPr>
             <w:r>
               <w:t>Brute Force</w:t>
             </w:r>
@@ -4733,48 +4288,36 @@
             </w:tcBorders>
           </w:tcPr>
           <w:p>
-            <w:pPr>
-              <w:pStyle w:val="tablecopy"/>
-              <w:cnfStyle w:val="000000000000" w:firstRow="0" w:lastRow="0" w:firstColumn="0" w:lastColumn="0" w:oddVBand="0" w:evenVBand="0" w:oddHBand="0" w:evenHBand="0" w:firstRowFirstColumn="0" w:firstRowLastColumn="0" w:lastRowFirstColumn="0" w:lastRowLastColumn="0"/>
-            </w:pPr>
-            <w:r>
-              <w:t>20%</w:t>
-            </w:r>
-          </w:p>
-        </w:tc>
-        <w:tc>
-          <w:tcPr>
-            <w:tcW w:w="0" w:type="auto"/>
-            <w:tcBorders>
-              <w:top w:val="nil"/>
-              <w:bottom w:val="nil"/>
-            </w:tcBorders>
-          </w:tcPr>
-          <w:p>
-            <w:pPr>
-              <w:pStyle w:val="tablecopy"/>
-              <w:cnfStyle w:val="000000000000" w:firstRow="0" w:lastRow="0" w:firstColumn="0" w:lastColumn="0" w:oddVBand="0" w:evenVBand="0" w:oddHBand="0" w:evenHBand="0" w:firstRowFirstColumn="0" w:firstRowLastColumn="0" w:lastRowFirstColumn="0" w:lastRowLastColumn="0"/>
-            </w:pPr>
-            <w:r>
-              <w:t>86.53</w:t>
-            </w:r>
-          </w:p>
-        </w:tc>
-        <w:tc>
-          <w:tcPr>
-            <w:tcW w:w="0" w:type="auto"/>
-            <w:tcBorders>
-              <w:top w:val="nil"/>
-              <w:bottom w:val="nil"/>
-            </w:tcBorders>
-          </w:tcPr>
-          <w:p>
-            <w:pPr>
-              <w:pStyle w:val="tablecopy"/>
-              <w:cnfStyle w:val="000000000000" w:firstRow="0" w:lastRow="0" w:firstColumn="0" w:lastColumn="0" w:oddVBand="0" w:evenVBand="0" w:oddHBand="0" w:evenHBand="0" w:firstRowFirstColumn="0" w:firstRowLastColumn="0" w:lastRowFirstColumn="0" w:lastRowLastColumn="0"/>
-            </w:pPr>
-            <w:r>
-              <w:t>91.9</w:t>
+            <w:r>
+              <w:t>30%</w:t>
+            </w:r>
+          </w:p>
+        </w:tc>
+        <w:tc>
+          <w:tcPr>
+            <w:tcW w:w="0" w:type="auto"/>
+            <w:tcBorders>
+              <w:top w:val="nil"/>
+              <w:bottom w:val="nil"/>
+            </w:tcBorders>
+          </w:tcPr>
+          <w:p>
+            <w:r>
+              <w:t>70.43</w:t>
+            </w:r>
+          </w:p>
+        </w:tc>
+        <w:tc>
+          <w:tcPr>
+            <w:tcW w:w="0" w:type="auto"/>
+            <w:tcBorders>
+              <w:top w:val="nil"/>
+              <w:bottom w:val="nil"/>
+            </w:tcBorders>
+          </w:tcPr>
+          <w:p>
+            <w:r>
+              <w:t>91.8</w:t>
             </w:r>
           </w:p>
         </w:tc>
@@ -4794,18 +4337,7 @@
             </w:tcBorders>
           </w:tcPr>
           <w:p>
-            <w:pPr>
-              <w:pStyle w:val="tablecopy"/>
-              <w:rPr>
-                <w:b w:val="0"/>
-                <w:bCs w:val="0"/>
-              </w:rPr>
-            </w:pPr>
-            <w:r>
-              <w:rPr>
-                <w:b w:val="0"/>
-                <w:bCs w:val="0"/>
-              </w:rPr>
+            <w:r>
               <w:t>Padat</w:t>
             </w:r>
           </w:p>
@@ -4819,10 +4351,6 @@
             </w:tcBorders>
           </w:tcPr>
           <w:p>
-            <w:pPr>
-              <w:pStyle w:val="tablecopy"/>
-              <w:cnfStyle w:val="000000100000" w:firstRow="0" w:lastRow="0" w:firstColumn="0" w:lastColumn="0" w:oddVBand="0" w:evenVBand="0" w:oddHBand="1" w:evenHBand="0" w:firstRowFirstColumn="0" w:firstRowLastColumn="0" w:lastRowFirstColumn="0" w:lastRowLastColumn="0"/>
-            </w:pPr>
             <w:r>
               <w:t>UCS</w:t>
             </w:r>
@@ -4837,48 +4365,36 @@
             </w:tcBorders>
           </w:tcPr>
           <w:p>
-            <w:pPr>
-              <w:pStyle w:val="tablecopy"/>
-              <w:cnfStyle w:val="000000100000" w:firstRow="0" w:lastRow="0" w:firstColumn="0" w:lastColumn="0" w:oddVBand="0" w:evenVBand="0" w:oddHBand="1" w:evenHBand="0" w:firstRowFirstColumn="0" w:firstRowLastColumn="0" w:lastRowFirstColumn="0" w:lastRowLastColumn="0"/>
-            </w:pPr>
-            <w:r>
-              <w:t>80%</w:t>
-            </w:r>
-          </w:p>
-        </w:tc>
-        <w:tc>
-          <w:tcPr>
-            <w:tcW w:w="0" w:type="auto"/>
-            <w:tcBorders>
-              <w:top w:val="nil"/>
-              <w:bottom w:val="nil"/>
-            </w:tcBorders>
-          </w:tcPr>
-          <w:p>
-            <w:pPr>
-              <w:pStyle w:val="tablecopy"/>
-              <w:cnfStyle w:val="000000100000" w:firstRow="0" w:lastRow="0" w:firstColumn="0" w:lastColumn="0" w:oddVBand="0" w:evenVBand="0" w:oddHBand="1" w:evenHBand="0" w:firstRowFirstColumn="0" w:firstRowLastColumn="0" w:lastRowFirstColumn="0" w:lastRowLastColumn="0"/>
-            </w:pPr>
-            <w:r>
-              <w:t>57.56</w:t>
-            </w:r>
-          </w:p>
-        </w:tc>
-        <w:tc>
-          <w:tcPr>
-            <w:tcW w:w="0" w:type="auto"/>
-            <w:tcBorders>
-              <w:top w:val="nil"/>
-              <w:bottom w:val="nil"/>
-            </w:tcBorders>
-          </w:tcPr>
-          <w:p>
-            <w:pPr>
-              <w:pStyle w:val="tablecopy"/>
-              <w:cnfStyle w:val="000000100000" w:firstRow="0" w:lastRow="0" w:firstColumn="0" w:lastColumn="0" w:oddVBand="0" w:evenVBand="0" w:oddHBand="1" w:evenHBand="0" w:firstRowFirstColumn="0" w:firstRowLastColumn="0" w:lastRowFirstColumn="0" w:lastRowLastColumn="0"/>
-            </w:pPr>
-            <w:r>
-              <w:t>732.6</w:t>
+            <w:r>
+              <w:t>100%</w:t>
+            </w:r>
+          </w:p>
+        </w:tc>
+        <w:tc>
+          <w:tcPr>
+            <w:tcW w:w="0" w:type="auto"/>
+            <w:tcBorders>
+              <w:top w:val="nil"/>
+              <w:bottom w:val="nil"/>
+            </w:tcBorders>
+          </w:tcPr>
+          <w:p>
+            <w:r>
+              <w:t>57.06</w:t>
+            </w:r>
+          </w:p>
+        </w:tc>
+        <w:tc>
+          <w:tcPr>
+            <w:tcW w:w="0" w:type="auto"/>
+            <w:tcBorders>
+              <w:top w:val="nil"/>
+              <w:bottom w:val="nil"/>
+            </w:tcBorders>
+          </w:tcPr>
+          <w:p>
+            <w:r>
+              <w:t>674.0</w:t>
             </w:r>
           </w:p>
         </w:tc>
@@ -4897,18 +4413,7 @@
             </w:tcBorders>
           </w:tcPr>
           <w:p>
-            <w:pPr>
-              <w:pStyle w:val="tablecopy"/>
-              <w:rPr>
-                <w:b w:val="0"/>
-                <w:bCs w:val="0"/>
-              </w:rPr>
-            </w:pPr>
-            <w:r>
-              <w:rPr>
-                <w:b w:val="0"/>
-                <w:bCs w:val="0"/>
-              </w:rPr>
+            <w:r>
               <w:t>Padat</w:t>
             </w:r>
           </w:p>
@@ -4922,10 +4427,6 @@
             </w:tcBorders>
           </w:tcPr>
           <w:p>
-            <w:pPr>
-              <w:pStyle w:val="tablecopy"/>
-              <w:cnfStyle w:val="000000000000" w:firstRow="0" w:lastRow="0" w:firstColumn="0" w:lastColumn="0" w:oddVBand="0" w:evenVBand="0" w:oddHBand="0" w:evenHBand="0" w:firstRowFirstColumn="0" w:firstRowLastColumn="0" w:lastRowFirstColumn="0" w:lastRowLastColumn="0"/>
-            </w:pPr>
             <w:r>
               <w:t>GBFS</w:t>
             </w:r>
@@ -4940,48 +4441,36 @@
             </w:tcBorders>
           </w:tcPr>
           <w:p>
-            <w:pPr>
-              <w:pStyle w:val="tablecopy"/>
-              <w:cnfStyle w:val="000000000000" w:firstRow="0" w:lastRow="0" w:firstColumn="0" w:lastColumn="0" w:oddVBand="0" w:evenVBand="0" w:oddHBand="0" w:evenHBand="0" w:firstRowFirstColumn="0" w:firstRowLastColumn="0" w:lastRowFirstColumn="0" w:lastRowLastColumn="0"/>
-            </w:pPr>
-            <w:r>
-              <w:t>80%</w:t>
-            </w:r>
-          </w:p>
-        </w:tc>
-        <w:tc>
-          <w:tcPr>
-            <w:tcW w:w="0" w:type="auto"/>
-            <w:tcBorders>
-              <w:top w:val="nil"/>
-              <w:bottom w:val="nil"/>
-            </w:tcBorders>
-          </w:tcPr>
-          <w:p>
-            <w:pPr>
-              <w:pStyle w:val="tablecopy"/>
-              <w:cnfStyle w:val="000000000000" w:firstRow="0" w:lastRow="0" w:firstColumn="0" w:lastColumn="0" w:oddVBand="0" w:evenVBand="0" w:oddHBand="0" w:evenHBand="0" w:firstRowFirstColumn="0" w:firstRowLastColumn="0" w:lastRowFirstColumn="0" w:lastRowLastColumn="0"/>
-            </w:pPr>
-            <w:r>
-              <w:t>60.15</w:t>
-            </w:r>
-          </w:p>
-        </w:tc>
-        <w:tc>
-          <w:tcPr>
-            <w:tcW w:w="0" w:type="auto"/>
-            <w:tcBorders>
-              <w:top w:val="nil"/>
-              <w:bottom w:val="nil"/>
-            </w:tcBorders>
-          </w:tcPr>
-          <w:p>
-            <w:pPr>
-              <w:pStyle w:val="tablecopy"/>
-              <w:cnfStyle w:val="000000000000" w:firstRow="0" w:lastRow="0" w:firstColumn="0" w:lastColumn="0" w:oddVBand="0" w:evenVBand="0" w:oddHBand="0" w:evenHBand="0" w:firstRowFirstColumn="0" w:firstRowLastColumn="0" w:lastRowFirstColumn="0" w:lastRowLastColumn="0"/>
-            </w:pPr>
-            <w:r>
-              <w:t>182.6</w:t>
+            <w:r>
+              <w:t>100%</w:t>
+            </w:r>
+          </w:p>
+        </w:tc>
+        <w:tc>
+          <w:tcPr>
+            <w:tcW w:w="0" w:type="auto"/>
+            <w:tcBorders>
+              <w:top w:val="nil"/>
+              <w:bottom w:val="nil"/>
+            </w:tcBorders>
+          </w:tcPr>
+          <w:p>
+            <w:r>
+              <w:t>60.44</w:t>
+            </w:r>
+          </w:p>
+        </w:tc>
+        <w:tc>
+          <w:tcPr>
+            <w:tcW w:w="0" w:type="auto"/>
+            <w:tcBorders>
+              <w:top w:val="nil"/>
+              <w:bottom w:val="nil"/>
+            </w:tcBorders>
+          </w:tcPr>
+          <w:p>
+            <w:r>
+              <w:t>20.1</w:t>
             </w:r>
           </w:p>
         </w:tc>
@@ -5001,18 +4490,7 @@
             </w:tcBorders>
           </w:tcPr>
           <w:p>
-            <w:pPr>
-              <w:pStyle w:val="tablecopy"/>
-              <w:rPr>
-                <w:b w:val="0"/>
-                <w:bCs w:val="0"/>
-              </w:rPr>
-            </w:pPr>
-            <w:r>
-              <w:rPr>
-                <w:b w:val="0"/>
-                <w:bCs w:val="0"/>
-              </w:rPr>
+            <w:r>
               <w:t>Padat</w:t>
             </w:r>
           </w:p>
@@ -5026,10 +4504,6 @@
             </w:tcBorders>
           </w:tcPr>
           <w:p>
-            <w:pPr>
-              <w:pStyle w:val="tablecopy"/>
-              <w:cnfStyle w:val="000000100000" w:firstRow="0" w:lastRow="0" w:firstColumn="0" w:lastColumn="0" w:oddVBand="0" w:evenVBand="0" w:oddHBand="1" w:evenHBand="0" w:firstRowFirstColumn="0" w:firstRowLastColumn="0" w:lastRowFirstColumn="0" w:lastRowLastColumn="0"/>
-            </w:pPr>
             <w:r>
               <w:t>A*</w:t>
             </w:r>
@@ -5044,48 +4518,36 @@
             </w:tcBorders>
           </w:tcPr>
           <w:p>
-            <w:pPr>
-              <w:pStyle w:val="tablecopy"/>
-              <w:cnfStyle w:val="000000100000" w:firstRow="0" w:lastRow="0" w:firstColumn="0" w:lastColumn="0" w:oddVBand="0" w:evenVBand="0" w:oddHBand="1" w:evenHBand="0" w:firstRowFirstColumn="0" w:firstRowLastColumn="0" w:lastRowFirstColumn="0" w:lastRowLastColumn="0"/>
-            </w:pPr>
-            <w:r>
-              <w:t>80%</w:t>
-            </w:r>
-          </w:p>
-        </w:tc>
-        <w:tc>
-          <w:tcPr>
-            <w:tcW w:w="0" w:type="auto"/>
-            <w:tcBorders>
-              <w:top w:val="nil"/>
-              <w:bottom w:val="nil"/>
-            </w:tcBorders>
-          </w:tcPr>
-          <w:p>
-            <w:pPr>
-              <w:pStyle w:val="tablecopy"/>
-              <w:cnfStyle w:val="000000100000" w:firstRow="0" w:lastRow="0" w:firstColumn="0" w:lastColumn="0" w:oddVBand="0" w:evenVBand="0" w:oddHBand="1" w:evenHBand="0" w:firstRowFirstColumn="0" w:firstRowLastColumn="0" w:lastRowFirstColumn="0" w:lastRowLastColumn="0"/>
-            </w:pPr>
-            <w:r>
-              <w:t>57.56</w:t>
-            </w:r>
-          </w:p>
-        </w:tc>
-        <w:tc>
-          <w:tcPr>
-            <w:tcW w:w="0" w:type="auto"/>
-            <w:tcBorders>
-              <w:top w:val="nil"/>
-              <w:bottom w:val="nil"/>
-            </w:tcBorders>
-          </w:tcPr>
-          <w:p>
-            <w:pPr>
-              <w:pStyle w:val="tablecopy"/>
-              <w:cnfStyle w:val="000000100000" w:firstRow="0" w:lastRow="0" w:firstColumn="0" w:lastColumn="0" w:oddVBand="0" w:evenVBand="0" w:oddHBand="1" w:evenHBand="0" w:firstRowFirstColumn="0" w:firstRowLastColumn="0" w:lastRowFirstColumn="0" w:lastRowLastColumn="0"/>
-            </w:pPr>
-            <w:r>
-              <w:t>244.9</w:t>
+            <w:r>
+              <w:t>100%</w:t>
+            </w:r>
+          </w:p>
+        </w:tc>
+        <w:tc>
+          <w:tcPr>
+            <w:tcW w:w="0" w:type="auto"/>
+            <w:tcBorders>
+              <w:top w:val="nil"/>
+              <w:bottom w:val="nil"/>
+            </w:tcBorders>
+          </w:tcPr>
+          <w:p>
+            <w:r>
+              <w:t>57.06</w:t>
+            </w:r>
+          </w:p>
+        </w:tc>
+        <w:tc>
+          <w:tcPr>
+            <w:tcW w:w="0" w:type="auto"/>
+            <w:tcBorders>
+              <w:top w:val="nil"/>
+              <w:bottom w:val="nil"/>
+            </w:tcBorders>
+          </w:tcPr>
+          <w:p>
+            <w:r>
+              <w:t>146.4</w:t>
             </w:r>
           </w:p>
         </w:tc>
@@ -5104,18 +4566,7 @@
             </w:tcBorders>
           </w:tcPr>
           <w:p>
-            <w:pPr>
-              <w:pStyle w:val="tablecopy"/>
-              <w:rPr>
-                <w:b w:val="0"/>
-                <w:bCs w:val="0"/>
-              </w:rPr>
-            </w:pPr>
-            <w:r>
-              <w:rPr>
-                <w:b w:val="0"/>
-                <w:bCs w:val="0"/>
-              </w:rPr>
+            <w:r>
               <w:t>Padat</w:t>
             </w:r>
           </w:p>
@@ -5129,10 +4580,6 @@
             </w:tcBorders>
           </w:tcPr>
           <w:p>
-            <w:pPr>
-              <w:pStyle w:val="tablecopy"/>
-              <w:cnfStyle w:val="000000000000" w:firstRow="0" w:lastRow="0" w:firstColumn="0" w:lastColumn="0" w:oddVBand="0" w:evenVBand="0" w:oddHBand="0" w:evenHBand="0" w:firstRowFirstColumn="0" w:firstRowLastColumn="0" w:lastRowFirstColumn="0" w:lastRowLastColumn="0"/>
-            </w:pPr>
             <w:r>
               <w:t>RRT*</w:t>
             </w:r>
@@ -5147,12 +4594,8 @@
             </w:tcBorders>
           </w:tcPr>
           <w:p>
-            <w:pPr>
-              <w:pStyle w:val="tablecopy"/>
-              <w:cnfStyle w:val="000000000000" w:firstRow="0" w:lastRow="0" w:firstColumn="0" w:lastColumn="0" w:oddVBand="0" w:evenVBand="0" w:oddHBand="0" w:evenHBand="0" w:firstRowFirstColumn="0" w:firstRowLastColumn="0" w:lastRowFirstColumn="0" w:lastRowLastColumn="0"/>
-            </w:pPr>
-            <w:r>
-              <w:t>80%</w:t>
+            <w:r>
+              <w:t>100%</w:t>
             </w:r>
           </w:p>
         </w:tc>
@@ -5165,12 +4608,8 @@
             </w:tcBorders>
           </w:tcPr>
           <w:p>
-            <w:pPr>
-              <w:pStyle w:val="tablecopy"/>
-              <w:cnfStyle w:val="000000000000" w:firstRow="0" w:lastRow="0" w:firstColumn="0" w:lastColumn="0" w:oddVBand="0" w:evenVBand="0" w:oddHBand="0" w:evenHBand="0" w:firstRowFirstColumn="0" w:firstRowLastColumn="0" w:lastRowFirstColumn="0" w:lastRowLastColumn="0"/>
-            </w:pPr>
-            <w:r>
-              <w:t>59.49</w:t>
+            <w:r>
+              <w:t>59.17</w:t>
             </w:r>
           </w:p>
         </w:tc>
@@ -5183,12 +4622,8 @@
             </w:tcBorders>
           </w:tcPr>
           <w:p>
-            <w:pPr>
-              <w:pStyle w:val="tablecopy"/>
-              <w:cnfStyle w:val="000000000000" w:firstRow="0" w:lastRow="0" w:firstColumn="0" w:lastColumn="0" w:oddVBand="0" w:evenVBand="0" w:oddHBand="0" w:evenHBand="0" w:firstRowFirstColumn="0" w:firstRowLastColumn="0" w:lastRowFirstColumn="0" w:lastRowLastColumn="0"/>
-            </w:pPr>
-            <w:r>
-              <w:t>686.2</w:t>
+            <w:r>
+              <w:t>974.2</w:t>
             </w:r>
           </w:p>
         </w:tc>
@@ -5254,6 +4689,7 @@
             <w:pPr>
               <w:pStyle w:val="BodyText"/>
               <w:spacing w:after="0"/>
+              <w:ind w:firstLine="0"/>
               <w:jc w:val="center"/>
               <w:rPr>
                 <w:sz w:val="15"/>
@@ -5281,6 +4717,7 @@
             <w:pPr>
               <w:pStyle w:val="BodyText"/>
               <w:spacing w:after="0"/>
+              <w:ind w:firstLine="0"/>
               <w:jc w:val="center"/>
               <w:cnfStyle w:val="100000000000" w:firstRow="1" w:lastRow="0" w:firstColumn="0" w:lastColumn="0" w:oddVBand="0" w:evenVBand="0" w:oddHBand="0" w:evenHBand="0" w:firstRowFirstColumn="0" w:firstRowLastColumn="0" w:lastRowFirstColumn="0" w:lastRowLastColumn="0"/>
               <w:rPr>
@@ -5309,6 +4746,7 @@
             <w:pPr>
               <w:pStyle w:val="BodyText"/>
               <w:spacing w:after="0"/>
+              <w:ind w:firstLine="0"/>
               <w:jc w:val="center"/>
               <w:cnfStyle w:val="100000000000" w:firstRow="1" w:lastRow="0" w:firstColumn="0" w:lastColumn="0" w:oddVBand="0" w:evenVBand="0" w:oddHBand="0" w:evenHBand="0" w:firstRowFirstColumn="0" w:firstRowLastColumn="0" w:lastRowFirstColumn="0" w:lastRowLastColumn="0"/>
               <w:rPr>
@@ -5340,22 +4778,9 @@
             </w:tcBorders>
           </w:tcPr>
           <w:p>
-            <w:pPr>
-              <w:pStyle w:val="tablecopy"/>
-              <w:rPr>
-                <w:b w:val="0"/>
-                <w:bCs w:val="0"/>
-              </w:rPr>
-            </w:pPr>
-            <w:proofErr w:type="spellStart"/>
-            <w:r>
-              <w:rPr>
-                <w:b w:val="0"/>
-                <w:bCs w:val="0"/>
-              </w:rPr>
+            <w:r>
               <w:t>Mudah</w:t>
             </w:r>
-            <w:proofErr w:type="spellEnd"/>
           </w:p>
         </w:tc>
         <w:tc>
@@ -5367,10 +4792,6 @@
             </w:tcBorders>
           </w:tcPr>
           <w:p>
-            <w:pPr>
-              <w:pStyle w:val="tablecopy"/>
-              <w:cnfStyle w:val="000000100000" w:firstRow="0" w:lastRow="0" w:firstColumn="0" w:lastColumn="0" w:oddVBand="0" w:evenVBand="0" w:oddHBand="1" w:evenHBand="0" w:firstRowFirstColumn="0" w:firstRowLastColumn="0" w:lastRowFirstColumn="0" w:lastRowLastColumn="0"/>
-            </w:pPr>
             <w:r>
               <w:t>Brute Force</w:t>
             </w:r>
@@ -5385,10 +4806,6 @@
             </w:tcBorders>
           </w:tcPr>
           <w:p>
-            <w:pPr>
-              <w:pStyle w:val="tablecopy"/>
-              <w:cnfStyle w:val="000000100000" w:firstRow="0" w:lastRow="0" w:firstColumn="0" w:lastColumn="0" w:oddVBand="0" w:evenVBand="0" w:oddHBand="1" w:evenHBand="0" w:firstRowFirstColumn="0" w:firstRowLastColumn="0" w:lastRowFirstColumn="0" w:lastRowLastColumn="0"/>
-            </w:pPr>
             <w:r>
               <w:t>12721</w:t>
             </w:r>
@@ -5406,22 +4823,9 @@
             </w:tcBorders>
           </w:tcPr>
           <w:p>
-            <w:pPr>
-              <w:pStyle w:val="tablecopy"/>
-              <w:rPr>
-                <w:b w:val="0"/>
-                <w:bCs w:val="0"/>
-              </w:rPr>
-            </w:pPr>
-            <w:proofErr w:type="spellStart"/>
-            <w:r>
-              <w:rPr>
-                <w:b w:val="0"/>
-                <w:bCs w:val="0"/>
-              </w:rPr>
+            <w:r>
               <w:t>Mudah</w:t>
             </w:r>
-            <w:proofErr w:type="spellEnd"/>
           </w:p>
         </w:tc>
         <w:tc>
@@ -5433,10 +4837,6 @@
             </w:tcBorders>
           </w:tcPr>
           <w:p>
-            <w:pPr>
-              <w:pStyle w:val="tablecopy"/>
-              <w:cnfStyle w:val="000000000000" w:firstRow="0" w:lastRow="0" w:firstColumn="0" w:lastColumn="0" w:oddVBand="0" w:evenVBand="0" w:oddHBand="0" w:evenHBand="0" w:firstRowFirstColumn="0" w:firstRowLastColumn="0" w:lastRowFirstColumn="0" w:lastRowLastColumn="0"/>
-            </w:pPr>
             <w:r>
               <w:t>UCS</w:t>
             </w:r>
@@ -5451,12 +4851,8 @@
             </w:tcBorders>
           </w:tcPr>
           <w:p>
-            <w:pPr>
-              <w:pStyle w:val="tablecopy"/>
-              <w:cnfStyle w:val="000000000000" w:firstRow="0" w:lastRow="0" w:firstColumn="0" w:lastColumn="0" w:oddVBand="0" w:evenVBand="0" w:oddHBand="0" w:evenHBand="0" w:firstRowFirstColumn="0" w:firstRowLastColumn="0" w:lastRowFirstColumn="0" w:lastRowLastColumn="0"/>
-            </w:pPr>
-            <w:r>
-              <w:t>2041</w:t>
+            <w:r>
+              <w:t>2036.2</w:t>
             </w:r>
           </w:p>
         </w:tc>
@@ -5475,22 +4871,9 @@
             </w:tcBorders>
           </w:tcPr>
           <w:p>
-            <w:pPr>
-              <w:pStyle w:val="tablecopy"/>
-              <w:rPr>
-                <w:b w:val="0"/>
-                <w:bCs w:val="0"/>
-              </w:rPr>
-            </w:pPr>
-            <w:proofErr w:type="spellStart"/>
-            <w:r>
-              <w:rPr>
-                <w:b w:val="0"/>
-                <w:bCs w:val="0"/>
-              </w:rPr>
+            <w:r>
               <w:t>Mudah</w:t>
             </w:r>
-            <w:proofErr w:type="spellEnd"/>
           </w:p>
         </w:tc>
         <w:tc>
@@ -5502,10 +4885,6 @@
             </w:tcBorders>
           </w:tcPr>
           <w:p>
-            <w:pPr>
-              <w:pStyle w:val="tablecopy"/>
-              <w:cnfStyle w:val="000000100000" w:firstRow="0" w:lastRow="0" w:firstColumn="0" w:lastColumn="0" w:oddVBand="0" w:evenVBand="0" w:oddHBand="1" w:evenHBand="0" w:firstRowFirstColumn="0" w:firstRowLastColumn="0" w:lastRowFirstColumn="0" w:lastRowLastColumn="0"/>
-            </w:pPr>
             <w:r>
               <w:t>GBFS</w:t>
             </w:r>
@@ -5520,12 +4899,8 @@
             </w:tcBorders>
           </w:tcPr>
           <w:p>
-            <w:pPr>
-              <w:pStyle w:val="tablecopy"/>
-              <w:cnfStyle w:val="000000100000" w:firstRow="0" w:lastRow="0" w:firstColumn="0" w:lastColumn="0" w:oddVBand="0" w:evenVBand="0" w:oddHBand="1" w:evenHBand="0" w:firstRowFirstColumn="0" w:firstRowLastColumn="0" w:lastRowFirstColumn="0" w:lastRowLastColumn="0"/>
-            </w:pPr>
-            <w:r>
-              <w:t>54.6</w:t>
+            <w:r>
+              <w:t>54.5</w:t>
             </w:r>
           </w:p>
         </w:tc>
@@ -5541,22 +4916,9 @@
             </w:tcBorders>
           </w:tcPr>
           <w:p>
-            <w:pPr>
-              <w:pStyle w:val="tablecopy"/>
-              <w:rPr>
-                <w:b w:val="0"/>
-                <w:bCs w:val="0"/>
-              </w:rPr>
-            </w:pPr>
-            <w:proofErr w:type="spellStart"/>
-            <w:r>
-              <w:rPr>
-                <w:b w:val="0"/>
-                <w:bCs w:val="0"/>
-              </w:rPr>
+            <w:r>
               <w:t>Mudah</w:t>
             </w:r>
-            <w:proofErr w:type="spellEnd"/>
           </w:p>
         </w:tc>
         <w:tc>
@@ -5568,10 +4930,6 @@
             </w:tcBorders>
           </w:tcPr>
           <w:p>
-            <w:pPr>
-              <w:pStyle w:val="tablecopy"/>
-              <w:cnfStyle w:val="000000000000" w:firstRow="0" w:lastRow="0" w:firstColumn="0" w:lastColumn="0" w:oddVBand="0" w:evenVBand="0" w:oddHBand="0" w:evenHBand="0" w:firstRowFirstColumn="0" w:firstRowLastColumn="0" w:lastRowFirstColumn="0" w:lastRowLastColumn="0"/>
-            </w:pPr>
             <w:r>
               <w:t>A*</w:t>
             </w:r>
@@ -5586,12 +4944,8 @@
             </w:tcBorders>
           </w:tcPr>
           <w:p>
-            <w:pPr>
-              <w:pStyle w:val="tablecopy"/>
-              <w:cnfStyle w:val="000000000000" w:firstRow="0" w:lastRow="0" w:firstColumn="0" w:lastColumn="0" w:oddVBand="0" w:evenVBand="0" w:oddHBand="0" w:evenHBand="0" w:firstRowFirstColumn="0" w:firstRowLastColumn="0" w:lastRowFirstColumn="0" w:lastRowLastColumn="0"/>
-            </w:pPr>
-            <w:r>
-              <w:t>246.2</w:t>
+            <w:r>
+              <w:t>238.1</w:t>
             </w:r>
           </w:p>
         </w:tc>
@@ -5610,22 +4964,9 @@
             </w:tcBorders>
           </w:tcPr>
           <w:p>
-            <w:pPr>
-              <w:pStyle w:val="tablecopy"/>
-              <w:rPr>
-                <w:b w:val="0"/>
-                <w:bCs w:val="0"/>
-              </w:rPr>
-            </w:pPr>
-            <w:proofErr w:type="spellStart"/>
-            <w:r>
-              <w:rPr>
-                <w:b w:val="0"/>
-                <w:bCs w:val="0"/>
-              </w:rPr>
+            <w:r>
               <w:t>Mudah</w:t>
             </w:r>
-            <w:proofErr w:type="spellEnd"/>
           </w:p>
         </w:tc>
         <w:tc>
@@ -5637,10 +4978,6 @@
             </w:tcBorders>
           </w:tcPr>
           <w:p>
-            <w:pPr>
-              <w:pStyle w:val="tablecopy"/>
-              <w:cnfStyle w:val="000000100000" w:firstRow="0" w:lastRow="0" w:firstColumn="0" w:lastColumn="0" w:oddVBand="0" w:evenVBand="0" w:oddHBand="1" w:evenHBand="0" w:firstRowFirstColumn="0" w:firstRowLastColumn="0" w:lastRowFirstColumn="0" w:lastRowLastColumn="0"/>
-            </w:pPr>
             <w:r>
               <w:t>RRT*</w:t>
             </w:r>
@@ -5655,12 +4992,8 @@
             </w:tcBorders>
           </w:tcPr>
           <w:p>
-            <w:pPr>
-              <w:pStyle w:val="tablecopy"/>
-              <w:cnfStyle w:val="000000100000" w:firstRow="0" w:lastRow="0" w:firstColumn="0" w:lastColumn="0" w:oddVBand="0" w:evenVBand="0" w:oddHBand="1" w:evenHBand="0" w:firstRowFirstColumn="0" w:firstRowLastColumn="0" w:lastRowFirstColumn="0" w:lastRowLastColumn="0"/>
-            </w:pPr>
-            <w:r>
-              <w:t>617</w:t>
+            <w:r>
+              <w:t>615.1</w:t>
             </w:r>
           </w:p>
         </w:tc>
@@ -5676,18 +5009,7 @@
             </w:tcBorders>
           </w:tcPr>
           <w:p>
-            <w:pPr>
-              <w:pStyle w:val="tablecopy"/>
-              <w:rPr>
-                <w:b w:val="0"/>
-                <w:bCs w:val="0"/>
-              </w:rPr>
-            </w:pPr>
-            <w:r>
-              <w:rPr>
-                <w:b w:val="0"/>
-                <w:bCs w:val="0"/>
-              </w:rPr>
+            <w:r>
               <w:t>Sedang</w:t>
             </w:r>
           </w:p>
@@ -5701,10 +5023,6 @@
             </w:tcBorders>
           </w:tcPr>
           <w:p>
-            <w:pPr>
-              <w:pStyle w:val="tablecopy"/>
-              <w:cnfStyle w:val="000000000000" w:firstRow="0" w:lastRow="0" w:firstColumn="0" w:lastColumn="0" w:oddVBand="0" w:evenVBand="0" w:oddHBand="0" w:evenHBand="0" w:firstRowFirstColumn="0" w:firstRowLastColumn="0" w:lastRowFirstColumn="0" w:lastRowLastColumn="0"/>
-            </w:pPr>
             <w:r>
               <w:t>Brute Force</w:t>
             </w:r>
@@ -5719,10 +5037,6 @@
             </w:tcBorders>
           </w:tcPr>
           <w:p>
-            <w:pPr>
-              <w:pStyle w:val="tablecopy"/>
-              <w:cnfStyle w:val="000000000000" w:firstRow="0" w:lastRow="0" w:firstColumn="0" w:lastColumn="0" w:oddVBand="0" w:evenVBand="0" w:oddHBand="0" w:evenHBand="0" w:firstRowFirstColumn="0" w:firstRowLastColumn="0" w:lastRowFirstColumn="0" w:lastRowLastColumn="0"/>
-            </w:pPr>
             <w:r>
               <w:t>12721</w:t>
             </w:r>
@@ -5743,18 +5057,7 @@
             </w:tcBorders>
           </w:tcPr>
           <w:p>
-            <w:pPr>
-              <w:pStyle w:val="tablecopy"/>
-              <w:rPr>
-                <w:b w:val="0"/>
-                <w:bCs w:val="0"/>
-              </w:rPr>
-            </w:pPr>
-            <w:r>
-              <w:rPr>
-                <w:b w:val="0"/>
-                <w:bCs w:val="0"/>
-              </w:rPr>
+            <w:r>
               <w:t>Sedang</w:t>
             </w:r>
           </w:p>
@@ -5768,10 +5071,6 @@
             </w:tcBorders>
           </w:tcPr>
           <w:p>
-            <w:pPr>
-              <w:pStyle w:val="tablecopy"/>
-              <w:cnfStyle w:val="000000100000" w:firstRow="0" w:lastRow="0" w:firstColumn="0" w:lastColumn="0" w:oddVBand="0" w:evenVBand="0" w:oddHBand="1" w:evenHBand="0" w:firstRowFirstColumn="0" w:firstRowLastColumn="0" w:lastRowFirstColumn="0" w:lastRowLastColumn="0"/>
-            </w:pPr>
             <w:r>
               <w:t>UCS</w:t>
             </w:r>
@@ -5786,12 +5085,8 @@
             </w:tcBorders>
           </w:tcPr>
           <w:p>
-            <w:pPr>
-              <w:pStyle w:val="tablecopy"/>
-              <w:cnfStyle w:val="000000100000" w:firstRow="0" w:lastRow="0" w:firstColumn="0" w:lastColumn="0" w:oddVBand="0" w:evenVBand="0" w:oddHBand="1" w:evenHBand="0" w:firstRowFirstColumn="0" w:firstRowLastColumn="0" w:lastRowFirstColumn="0" w:lastRowLastColumn="0"/>
-            </w:pPr>
-            <w:r>
-              <w:t>1828.2</w:t>
+            <w:r>
+              <w:t>1817.2</w:t>
             </w:r>
           </w:p>
         </w:tc>
@@ -5807,19 +5102,7 @@
             </w:tcBorders>
           </w:tcPr>
           <w:p>
-            <w:pPr>
-              <w:pStyle w:val="tablecopy"/>
-              <w:rPr>
-                <w:b w:val="0"/>
-                <w:bCs w:val="0"/>
-              </w:rPr>
-            </w:pPr>
-            <w:r>
-              <w:rPr>
-                <w:b w:val="0"/>
-                <w:bCs w:val="0"/>
-              </w:rPr>
-              <w:lastRenderedPageBreak/>
+            <w:r>
               <w:t>Sedang</w:t>
             </w:r>
           </w:p>
@@ -5833,10 +5116,6 @@
             </w:tcBorders>
           </w:tcPr>
           <w:p>
-            <w:pPr>
-              <w:pStyle w:val="tablecopy"/>
-              <w:cnfStyle w:val="000000000000" w:firstRow="0" w:lastRow="0" w:firstColumn="0" w:lastColumn="0" w:oddVBand="0" w:evenVBand="0" w:oddHBand="0" w:evenHBand="0" w:firstRowFirstColumn="0" w:firstRowLastColumn="0" w:lastRowFirstColumn="0" w:lastRowLastColumn="0"/>
-            </w:pPr>
             <w:r>
               <w:t>GBFS</w:t>
             </w:r>
@@ -5851,12 +5130,8 @@
             </w:tcBorders>
           </w:tcPr>
           <w:p>
-            <w:pPr>
-              <w:pStyle w:val="tablecopy"/>
-              <w:cnfStyle w:val="000000000000" w:firstRow="0" w:lastRow="0" w:firstColumn="0" w:lastColumn="0" w:oddVBand="0" w:evenVBand="0" w:oddHBand="0" w:evenHBand="0" w:firstRowFirstColumn="0" w:firstRowLastColumn="0" w:lastRowFirstColumn="0" w:lastRowLastColumn="0"/>
-            </w:pPr>
-            <w:r>
-              <w:t>54.8</w:t>
+            <w:r>
+              <w:t>78.8</w:t>
             </w:r>
           </w:p>
         </w:tc>
@@ -5875,18 +5150,7 @@
             </w:tcBorders>
           </w:tcPr>
           <w:p>
-            <w:pPr>
-              <w:pStyle w:val="tablecopy"/>
-              <w:rPr>
-                <w:b w:val="0"/>
-                <w:bCs w:val="0"/>
-              </w:rPr>
-            </w:pPr>
-            <w:r>
-              <w:rPr>
-                <w:b w:val="0"/>
-                <w:bCs w:val="0"/>
-              </w:rPr>
+            <w:r>
               <w:t>Sedang</w:t>
             </w:r>
           </w:p>
@@ -5900,10 +5164,6 @@
             </w:tcBorders>
           </w:tcPr>
           <w:p>
-            <w:pPr>
-              <w:pStyle w:val="tablecopy"/>
-              <w:cnfStyle w:val="000000100000" w:firstRow="0" w:lastRow="0" w:firstColumn="0" w:lastColumn="0" w:oddVBand="0" w:evenVBand="0" w:oddHBand="1" w:evenHBand="0" w:firstRowFirstColumn="0" w:firstRowLastColumn="0" w:lastRowFirstColumn="0" w:lastRowLastColumn="0"/>
-            </w:pPr>
             <w:r>
               <w:t>A*</w:t>
             </w:r>
@@ -5918,12 +5178,8 @@
             </w:tcBorders>
           </w:tcPr>
           <w:p>
-            <w:pPr>
-              <w:pStyle w:val="tablecopy"/>
-              <w:cnfStyle w:val="000000100000" w:firstRow="0" w:lastRow="0" w:firstColumn="0" w:lastColumn="0" w:oddVBand="0" w:evenVBand="0" w:oddHBand="1" w:evenHBand="0" w:firstRowFirstColumn="0" w:firstRowLastColumn="0" w:lastRowFirstColumn="0" w:lastRowLastColumn="0"/>
-            </w:pPr>
-            <w:r>
-              <w:t>226.6</w:t>
+            <w:r>
+              <w:t>307.1</w:t>
             </w:r>
           </w:p>
         </w:tc>
@@ -5939,18 +5195,7 @@
             </w:tcBorders>
           </w:tcPr>
           <w:p>
-            <w:pPr>
-              <w:pStyle w:val="tablecopy"/>
-              <w:rPr>
-                <w:b w:val="0"/>
-                <w:bCs w:val="0"/>
-              </w:rPr>
-            </w:pPr>
-            <w:r>
-              <w:rPr>
-                <w:b w:val="0"/>
-                <w:bCs w:val="0"/>
-              </w:rPr>
+            <w:r>
               <w:t>Sedang</w:t>
             </w:r>
           </w:p>
@@ -5964,10 +5209,6 @@
             </w:tcBorders>
           </w:tcPr>
           <w:p>
-            <w:pPr>
-              <w:pStyle w:val="tablecopy"/>
-              <w:cnfStyle w:val="000000000000" w:firstRow="0" w:lastRow="0" w:firstColumn="0" w:lastColumn="0" w:oddVBand="0" w:evenVBand="0" w:oddHBand="0" w:evenHBand="0" w:firstRowFirstColumn="0" w:firstRowLastColumn="0" w:lastRowFirstColumn="0" w:lastRowLastColumn="0"/>
-            </w:pPr>
             <w:r>
               <w:t>RRT*</w:t>
             </w:r>
@@ -5982,12 +5223,8 @@
             </w:tcBorders>
           </w:tcPr>
           <w:p>
-            <w:pPr>
-              <w:pStyle w:val="tablecopy"/>
-              <w:cnfStyle w:val="000000000000" w:firstRow="0" w:lastRow="0" w:firstColumn="0" w:lastColumn="0" w:oddVBand="0" w:evenVBand="0" w:oddHBand="0" w:evenHBand="0" w:firstRowFirstColumn="0" w:firstRowLastColumn="0" w:lastRowFirstColumn="0" w:lastRowLastColumn="0"/>
-            </w:pPr>
-            <w:r>
-              <w:t>576.2</w:t>
+            <w:r>
+              <w:t>559.2</w:t>
             </w:r>
           </w:p>
         </w:tc>
@@ -6006,18 +5243,7 @@
             </w:tcBorders>
           </w:tcPr>
           <w:p>
-            <w:pPr>
-              <w:pStyle w:val="tablecopy"/>
-              <w:rPr>
-                <w:b w:val="0"/>
-                <w:bCs w:val="0"/>
-              </w:rPr>
-            </w:pPr>
-            <w:r>
-              <w:rPr>
-                <w:b w:val="0"/>
-                <w:bCs w:val="0"/>
-              </w:rPr>
+            <w:r>
               <w:t>Sulit</w:t>
             </w:r>
           </w:p>
@@ -6031,10 +5257,6 @@
             </w:tcBorders>
           </w:tcPr>
           <w:p>
-            <w:pPr>
-              <w:pStyle w:val="tablecopy"/>
-              <w:cnfStyle w:val="000000100000" w:firstRow="0" w:lastRow="0" w:firstColumn="0" w:lastColumn="0" w:oddVBand="0" w:evenVBand="0" w:oddHBand="1" w:evenHBand="0" w:firstRowFirstColumn="0" w:firstRowLastColumn="0" w:lastRowFirstColumn="0" w:lastRowLastColumn="0"/>
-            </w:pPr>
             <w:r>
               <w:t>Brute Force</w:t>
             </w:r>
@@ -6049,10 +5271,6 @@
             </w:tcBorders>
           </w:tcPr>
           <w:p>
-            <w:pPr>
-              <w:pStyle w:val="tablecopy"/>
-              <w:cnfStyle w:val="000000100000" w:firstRow="0" w:lastRow="0" w:firstColumn="0" w:lastColumn="0" w:oddVBand="0" w:evenVBand="0" w:oddHBand="1" w:evenHBand="0" w:firstRowFirstColumn="0" w:firstRowLastColumn="0" w:lastRowFirstColumn="0" w:lastRowLastColumn="0"/>
-            </w:pPr>
             <w:r>
               <w:t>12721</w:t>
             </w:r>
@@ -6070,18 +5288,7 @@
             </w:tcBorders>
           </w:tcPr>
           <w:p>
-            <w:pPr>
-              <w:pStyle w:val="tablecopy"/>
-              <w:rPr>
-                <w:b w:val="0"/>
-                <w:bCs w:val="0"/>
-              </w:rPr>
-            </w:pPr>
-            <w:r>
-              <w:rPr>
-                <w:b w:val="0"/>
-                <w:bCs w:val="0"/>
-              </w:rPr>
+            <w:r>
               <w:t>Sulit</w:t>
             </w:r>
           </w:p>
@@ -6095,10 +5302,6 @@
             </w:tcBorders>
           </w:tcPr>
           <w:p>
-            <w:pPr>
-              <w:pStyle w:val="tablecopy"/>
-              <w:cnfStyle w:val="000000000000" w:firstRow="0" w:lastRow="0" w:firstColumn="0" w:lastColumn="0" w:oddVBand="0" w:evenVBand="0" w:oddHBand="0" w:evenHBand="0" w:firstRowFirstColumn="0" w:firstRowLastColumn="0" w:lastRowFirstColumn="0" w:lastRowLastColumn="0"/>
-            </w:pPr>
             <w:r>
               <w:t>UCS</w:t>
             </w:r>
@@ -6113,12 +5316,8 @@
             </w:tcBorders>
           </w:tcPr>
           <w:p>
-            <w:pPr>
-              <w:pStyle w:val="tablecopy"/>
-              <w:cnfStyle w:val="000000000000" w:firstRow="0" w:lastRow="0" w:firstColumn="0" w:lastColumn="0" w:oddVBand="0" w:evenVBand="0" w:oddHBand="0" w:evenHBand="0" w:firstRowFirstColumn="0" w:firstRowLastColumn="0" w:lastRowFirstColumn="0" w:lastRowLastColumn="0"/>
-            </w:pPr>
-            <w:r>
-              <w:t>1808</w:t>
+            <w:r>
+              <w:t>1796.8</w:t>
             </w:r>
           </w:p>
         </w:tc>
@@ -6137,18 +5336,7 @@
             </w:tcBorders>
           </w:tcPr>
           <w:p>
-            <w:pPr>
-              <w:pStyle w:val="tablecopy"/>
-              <w:rPr>
-                <w:b w:val="0"/>
-                <w:bCs w:val="0"/>
-              </w:rPr>
-            </w:pPr>
-            <w:r>
-              <w:rPr>
-                <w:b w:val="0"/>
-                <w:bCs w:val="0"/>
-              </w:rPr>
+            <w:r>
               <w:t>Sulit</w:t>
             </w:r>
           </w:p>
@@ -6162,10 +5350,6 @@
             </w:tcBorders>
           </w:tcPr>
           <w:p>
-            <w:pPr>
-              <w:pStyle w:val="tablecopy"/>
-              <w:cnfStyle w:val="000000100000" w:firstRow="0" w:lastRow="0" w:firstColumn="0" w:lastColumn="0" w:oddVBand="0" w:evenVBand="0" w:oddHBand="1" w:evenHBand="0" w:firstRowFirstColumn="0" w:firstRowLastColumn="0" w:lastRowFirstColumn="0" w:lastRowLastColumn="0"/>
-            </w:pPr>
             <w:r>
               <w:t>GBFS</w:t>
             </w:r>
@@ -6180,12 +5364,8 @@
             </w:tcBorders>
           </w:tcPr>
           <w:p>
-            <w:pPr>
-              <w:pStyle w:val="tablecopy"/>
-              <w:cnfStyle w:val="000000100000" w:firstRow="0" w:lastRow="0" w:firstColumn="0" w:lastColumn="0" w:oddVBand="0" w:evenVBand="0" w:oddHBand="1" w:evenHBand="0" w:firstRowFirstColumn="0" w:firstRowLastColumn="0" w:lastRowFirstColumn="0" w:lastRowLastColumn="0"/>
-            </w:pPr>
-            <w:r>
-              <w:t>140.2</w:t>
+            <w:r>
+              <w:t>130.8</w:t>
             </w:r>
           </w:p>
         </w:tc>
@@ -6201,18 +5381,7 @@
             </w:tcBorders>
           </w:tcPr>
           <w:p>
-            <w:pPr>
-              <w:pStyle w:val="tablecopy"/>
-              <w:rPr>
-                <w:b w:val="0"/>
-                <w:bCs w:val="0"/>
-              </w:rPr>
-            </w:pPr>
-            <w:r>
-              <w:rPr>
-                <w:b w:val="0"/>
-                <w:bCs w:val="0"/>
-              </w:rPr>
+            <w:r>
               <w:t>Sulit</w:t>
             </w:r>
           </w:p>
@@ -6226,10 +5395,6 @@
             </w:tcBorders>
           </w:tcPr>
           <w:p>
-            <w:pPr>
-              <w:pStyle w:val="tablecopy"/>
-              <w:cnfStyle w:val="000000000000" w:firstRow="0" w:lastRow="0" w:firstColumn="0" w:lastColumn="0" w:oddVBand="0" w:evenVBand="0" w:oddHBand="0" w:evenHBand="0" w:firstRowFirstColumn="0" w:firstRowLastColumn="0" w:lastRowFirstColumn="0" w:lastRowLastColumn="0"/>
-            </w:pPr>
             <w:r>
               <w:t>A*</w:t>
             </w:r>
@@ -6244,12 +5409,8 @@
             </w:tcBorders>
           </w:tcPr>
           <w:p>
-            <w:pPr>
-              <w:pStyle w:val="tablecopy"/>
-              <w:cnfStyle w:val="000000000000" w:firstRow="0" w:lastRow="0" w:firstColumn="0" w:lastColumn="0" w:oddVBand="0" w:evenVBand="0" w:oddHBand="0" w:evenHBand="0" w:firstRowFirstColumn="0" w:firstRowLastColumn="0" w:lastRowFirstColumn="0" w:lastRowLastColumn="0"/>
-            </w:pPr>
-            <w:r>
-              <w:t>1037</w:t>
+            <w:r>
+              <w:t>1030.8</w:t>
             </w:r>
           </w:p>
         </w:tc>
@@ -6268,18 +5429,7 @@
             </w:tcBorders>
           </w:tcPr>
           <w:p>
-            <w:pPr>
-              <w:pStyle w:val="tablecopy"/>
-              <w:rPr>
-                <w:b w:val="0"/>
-                <w:bCs w:val="0"/>
-              </w:rPr>
-            </w:pPr>
-            <w:r>
-              <w:rPr>
-                <w:b w:val="0"/>
-                <w:bCs w:val="0"/>
-              </w:rPr>
+            <w:r>
               <w:t>Sulit</w:t>
             </w:r>
           </w:p>
@@ -6293,10 +5443,6 @@
             </w:tcBorders>
           </w:tcPr>
           <w:p>
-            <w:pPr>
-              <w:pStyle w:val="tablecopy"/>
-              <w:cnfStyle w:val="000000100000" w:firstRow="0" w:lastRow="0" w:firstColumn="0" w:lastColumn="0" w:oddVBand="0" w:evenVBand="0" w:oddHBand="1" w:evenHBand="0" w:firstRowFirstColumn="0" w:firstRowLastColumn="0" w:lastRowFirstColumn="0" w:lastRowLastColumn="0"/>
-            </w:pPr>
             <w:r>
               <w:t>RRT*</w:t>
             </w:r>
@@ -6311,12 +5457,8 @@
             </w:tcBorders>
           </w:tcPr>
           <w:p>
-            <w:pPr>
-              <w:pStyle w:val="tablecopy"/>
-              <w:cnfStyle w:val="000000100000" w:firstRow="0" w:lastRow="0" w:firstColumn="0" w:lastColumn="0" w:oddVBand="0" w:evenVBand="0" w:oddHBand="1" w:evenHBand="0" w:firstRowFirstColumn="0" w:firstRowLastColumn="0" w:lastRowFirstColumn="0" w:lastRowLastColumn="0"/>
-            </w:pPr>
-            <w:r>
-              <w:t>372</w:t>
+            <w:r>
+              <w:t>389.7</w:t>
             </w:r>
           </w:p>
         </w:tc>
@@ -6332,22 +5474,9 @@
             </w:tcBorders>
           </w:tcPr>
           <w:p>
-            <w:pPr>
-              <w:pStyle w:val="tablecopy"/>
-              <w:rPr>
-                <w:b w:val="0"/>
-                <w:bCs w:val="0"/>
-              </w:rPr>
-            </w:pPr>
-            <w:proofErr w:type="spellStart"/>
-            <w:r>
-              <w:rPr>
-                <w:b w:val="0"/>
-                <w:bCs w:val="0"/>
-              </w:rPr>
+            <w:r>
               <w:t>Padat</w:t>
             </w:r>
-            <w:proofErr w:type="spellEnd"/>
           </w:p>
         </w:tc>
         <w:tc>
@@ -6359,10 +5488,6 @@
             </w:tcBorders>
           </w:tcPr>
           <w:p>
-            <w:pPr>
-              <w:pStyle w:val="tablecopy"/>
-              <w:cnfStyle w:val="000000000000" w:firstRow="0" w:lastRow="0" w:firstColumn="0" w:lastColumn="0" w:oddVBand="0" w:evenVBand="0" w:oddHBand="0" w:evenHBand="0" w:firstRowFirstColumn="0" w:firstRowLastColumn="0" w:lastRowFirstColumn="0" w:lastRowLastColumn="0"/>
-            </w:pPr>
             <w:r>
               <w:t>Brute Force</w:t>
             </w:r>
@@ -6377,10 +5502,6 @@
             </w:tcBorders>
           </w:tcPr>
           <w:p>
-            <w:pPr>
-              <w:pStyle w:val="tablecopy"/>
-              <w:cnfStyle w:val="000000000000" w:firstRow="0" w:lastRow="0" w:firstColumn="0" w:lastColumn="0" w:oddVBand="0" w:evenVBand="0" w:oddHBand="0" w:evenHBand="0" w:firstRowFirstColumn="0" w:firstRowLastColumn="0" w:lastRowFirstColumn="0" w:lastRowLastColumn="0"/>
-            </w:pPr>
             <w:r>
               <w:t>12721</w:t>
             </w:r>
@@ -6401,22 +5522,9 @@
             </w:tcBorders>
           </w:tcPr>
           <w:p>
-            <w:pPr>
-              <w:pStyle w:val="tablecopy"/>
-              <w:rPr>
-                <w:b w:val="0"/>
-                <w:bCs w:val="0"/>
-              </w:rPr>
-            </w:pPr>
-            <w:proofErr w:type="spellStart"/>
-            <w:r>
-              <w:rPr>
-                <w:b w:val="0"/>
-                <w:bCs w:val="0"/>
-              </w:rPr>
+            <w:r>
               <w:t>Padat</w:t>
             </w:r>
-            <w:proofErr w:type="spellEnd"/>
           </w:p>
         </w:tc>
         <w:tc>
@@ -6428,10 +5536,6 @@
             </w:tcBorders>
           </w:tcPr>
           <w:p>
-            <w:pPr>
-              <w:pStyle w:val="tablecopy"/>
-              <w:cnfStyle w:val="000000100000" w:firstRow="0" w:lastRow="0" w:firstColumn="0" w:lastColumn="0" w:oddVBand="0" w:evenVBand="0" w:oddHBand="1" w:evenHBand="0" w:firstRowFirstColumn="0" w:firstRowLastColumn="0" w:lastRowFirstColumn="0" w:lastRowLastColumn="0"/>
-            </w:pPr>
             <w:r>
               <w:t>UCS</w:t>
             </w:r>
@@ -6446,12 +5550,8 @@
             </w:tcBorders>
           </w:tcPr>
           <w:p>
-            <w:pPr>
-              <w:pStyle w:val="tablecopy"/>
-              <w:cnfStyle w:val="000000100000" w:firstRow="0" w:lastRow="0" w:firstColumn="0" w:lastColumn="0" w:oddVBand="0" w:evenVBand="0" w:oddHBand="1" w:evenHBand="0" w:firstRowFirstColumn="0" w:firstRowLastColumn="0" w:lastRowFirstColumn="0" w:lastRowLastColumn="0"/>
-            </w:pPr>
-            <w:r>
-              <w:t>1610.6</w:t>
+            <w:r>
+              <w:t>1743.3</w:t>
             </w:r>
           </w:p>
         </w:tc>
@@ -6467,22 +5567,9 @@
             </w:tcBorders>
           </w:tcPr>
           <w:p>
-            <w:pPr>
-              <w:pStyle w:val="tablecopy"/>
-              <w:rPr>
-                <w:b w:val="0"/>
-                <w:bCs w:val="0"/>
-              </w:rPr>
-            </w:pPr>
-            <w:proofErr w:type="spellStart"/>
-            <w:r>
-              <w:rPr>
-                <w:b w:val="0"/>
-                <w:bCs w:val="0"/>
-              </w:rPr>
+            <w:r>
               <w:t>Padat</w:t>
             </w:r>
-            <w:proofErr w:type="spellEnd"/>
           </w:p>
         </w:tc>
         <w:tc>
@@ -6494,10 +5581,6 @@
             </w:tcBorders>
           </w:tcPr>
           <w:p>
-            <w:pPr>
-              <w:pStyle w:val="tablecopy"/>
-              <w:cnfStyle w:val="000000000000" w:firstRow="0" w:lastRow="0" w:firstColumn="0" w:lastColumn="0" w:oddVBand="0" w:evenVBand="0" w:oddHBand="0" w:evenHBand="0" w:firstRowFirstColumn="0" w:firstRowLastColumn="0" w:lastRowFirstColumn="0" w:lastRowLastColumn="0"/>
-            </w:pPr>
             <w:r>
               <w:t>GBFS</w:t>
             </w:r>
@@ -6512,12 +5595,8 @@
             </w:tcBorders>
           </w:tcPr>
           <w:p>
-            <w:pPr>
-              <w:pStyle w:val="tablecopy"/>
-              <w:cnfStyle w:val="000000000000" w:firstRow="0" w:lastRow="0" w:firstColumn="0" w:lastColumn="0" w:oddVBand="0" w:evenVBand="0" w:oddHBand="0" w:evenHBand="0" w:firstRowFirstColumn="0" w:firstRowLastColumn="0" w:lastRowFirstColumn="0" w:lastRowLastColumn="0"/>
-            </w:pPr>
-            <w:r>
-              <w:t>259.2</w:t>
+            <w:r>
+              <w:t>66</w:t>
             </w:r>
           </w:p>
         </w:tc>
@@ -6536,22 +5615,9 @@
             </w:tcBorders>
           </w:tcPr>
           <w:p>
-            <w:pPr>
-              <w:pStyle w:val="tablecopy"/>
-              <w:rPr>
-                <w:b w:val="0"/>
-                <w:bCs w:val="0"/>
-              </w:rPr>
-            </w:pPr>
-            <w:proofErr w:type="spellStart"/>
-            <w:r>
-              <w:rPr>
-                <w:b w:val="0"/>
-                <w:bCs w:val="0"/>
-              </w:rPr>
+            <w:r>
               <w:t>Padat</w:t>
             </w:r>
-            <w:proofErr w:type="spellEnd"/>
           </w:p>
         </w:tc>
         <w:tc>
@@ -6563,10 +5629,6 @@
             </w:tcBorders>
           </w:tcPr>
           <w:p>
-            <w:pPr>
-              <w:pStyle w:val="tablecopy"/>
-              <w:cnfStyle w:val="000000100000" w:firstRow="0" w:lastRow="0" w:firstColumn="0" w:lastColumn="0" w:oddVBand="0" w:evenVBand="0" w:oddHBand="1" w:evenHBand="0" w:firstRowFirstColumn="0" w:firstRowLastColumn="0" w:lastRowFirstColumn="0" w:lastRowLastColumn="0"/>
-            </w:pPr>
             <w:r>
               <w:t>A*</w:t>
             </w:r>
@@ -6581,12 +5643,8 @@
             </w:tcBorders>
           </w:tcPr>
           <w:p>
-            <w:pPr>
-              <w:pStyle w:val="tablecopy"/>
-              <w:cnfStyle w:val="000000100000" w:firstRow="0" w:lastRow="0" w:firstColumn="0" w:lastColumn="0" w:oddVBand="0" w:evenVBand="0" w:oddHBand="1" w:evenHBand="0" w:firstRowFirstColumn="0" w:firstRowLastColumn="0" w:lastRowFirstColumn="0" w:lastRowLastColumn="0"/>
-            </w:pPr>
-            <w:r>
-              <w:t>518.2</w:t>
+            <w:r>
+              <w:t>373.6</w:t>
             </w:r>
           </w:p>
         </w:tc>
@@ -6602,22 +5660,9 @@
             </w:tcBorders>
           </w:tcPr>
           <w:p>
-            <w:pPr>
-              <w:pStyle w:val="tablecopy"/>
-              <w:rPr>
-                <w:b w:val="0"/>
-                <w:bCs w:val="0"/>
-              </w:rPr>
-            </w:pPr>
-            <w:proofErr w:type="spellStart"/>
-            <w:r>
-              <w:rPr>
-                <w:b w:val="0"/>
-                <w:bCs w:val="0"/>
-              </w:rPr>
+            <w:r>
               <w:t>Padat</w:t>
             </w:r>
-            <w:proofErr w:type="spellEnd"/>
           </w:p>
         </w:tc>
         <w:tc>
@@ -6629,10 +5674,6 @@
             </w:tcBorders>
           </w:tcPr>
           <w:p>
-            <w:pPr>
-              <w:pStyle w:val="tablecopy"/>
-              <w:cnfStyle w:val="000000000000" w:firstRow="0" w:lastRow="0" w:firstColumn="0" w:lastColumn="0" w:oddVBand="0" w:evenVBand="0" w:oddHBand="0" w:evenHBand="0" w:firstRowFirstColumn="0" w:firstRowLastColumn="0" w:lastRowFirstColumn="0" w:lastRowLastColumn="0"/>
-            </w:pPr>
             <w:r>
               <w:t>RRT*</w:t>
             </w:r>
@@ -6647,12 +5688,8 @@
             </w:tcBorders>
           </w:tcPr>
           <w:p>
-            <w:pPr>
-              <w:pStyle w:val="tablecopy"/>
-              <w:cnfStyle w:val="000000000000" w:firstRow="0" w:lastRow="0" w:firstColumn="0" w:lastColumn="0" w:oddVBand="0" w:evenVBand="0" w:oddHBand="0" w:evenHBand="0" w:firstRowFirstColumn="0" w:firstRowLastColumn="0" w:lastRowFirstColumn="0" w:lastRowLastColumn="0"/>
-            </w:pPr>
-            <w:r>
-              <w:t>690</w:t>
+            <w:r>
+              <w:t>768.9</w:t>
             </w:r>
           </w:p>
         </w:tc>
@@ -6681,39 +5718,7 @@
         </w:rPr>
       </w:pPr>
       <w:r>
-        <w:t xml:space="preserve">Pada </w:t>
-      </w:r>
-      <w:proofErr w:type="spellStart"/>
-      <w:r>
-        <w:t>skenario</w:t>
-      </w:r>
-      <w:proofErr w:type="spellEnd"/>
-      <w:r>
-        <w:t xml:space="preserve"> </w:t>
-      </w:r>
-      <w:proofErr w:type="spellStart"/>
-      <w:r>
-        <w:t>mudah</w:t>
-      </w:r>
-      <w:proofErr w:type="spellEnd"/>
-      <w:r>
-        <w:t xml:space="preserve">, </w:t>
-      </w:r>
-      <w:proofErr w:type="spellStart"/>
-      <w:r>
-        <w:t>seluruh</w:t>
-      </w:r>
-      <w:proofErr w:type="spellEnd"/>
-      <w:r>
-        <w:t xml:space="preserve"> </w:t>
-      </w:r>
-      <w:proofErr w:type="spellStart"/>
-      <w:r>
-        <w:t>algoritma</w:t>
-      </w:r>
-      <w:proofErr w:type="spellEnd"/>
-      <w:r>
-        <w:t xml:space="preserve"> berhasil menemukan jalur. GBFS menjadi metode grid tercepat dengan waktu rata-rata 7,4 ms, tetapi biaya lintasannya 55,44, lebih tinggi daripada UCS dan A* yang sama-sama 54,82. Brute Force menghasilkan biaya 53,34 karena memakai segmen waypoint kontinu, tetapi tetap memeriksa 12.721 kandidat rute. RRT* berhasil menemukan jalur dengan biaya 57,25 dan waktu 197,9 ms.</w:t>
+        <w:t>Pada skenario mudah, UCS dan A* sama-sama berhasil 100% dengan biaya 54,74. A* memproses rata-rata 238,1 simpul dibanding 2036,2 pada UCS. GBFS paling cepat pada 8,3 ms, tetapi biayanya 55,30. Brute Force berhasil 100% dan RRT* 100%; detour ratio keduanya masing-masing 1,007 dan 1,082.</w:t>
       </w:r>
     </w:p>
     <w:p>
@@ -6724,7 +5729,7 @@
         </w:rPr>
       </w:pPr>
       <w:r>
-        <w:t>Pada skenario sedang, Brute Force hanya berhasil pada 80% percobaan karena kandidat waypoint tidak selalu cukup untuk melewati celah hambatan. UCS, GBFS, A*, dan RRT* berhasil 100%. A* mempertahankan biaya optimal seperti UCS, yaitu 54,49, tetapi waktunya lebih kecil, sekitar 46,9 ms dibanding 413,5 ms pada UCS. GBFS tetap menjadi metode grid tercepat pada 11,1 ms, sedangkan RRT* membutuhkan 288,8 ms.</w:t>
+        <w:t>Pada skenario sedang, UCS dan A* sama-sama berhasil 100% dengan biaya 55,40. A* memproses rata-rata 307,1 simpul dibanding 1817,2 pada UCS. GBFS paling cepat pada 18,7 ms, tetapi biayanya 56,38. Brute Force berhasil 80% dan RRT* 100%; detour ratio keduanya masing-masing 1,051 dan 1,082.</w:t>
       </w:r>
     </w:p>
     <w:p>
@@ -6735,7 +5740,7 @@
         </w:rPr>
       </w:pPr>
       <w:r>
-        <w:t>Pada skenario sulit, Brute Force turun menjadi 20% keberhasilan. UCS, GBFS, dan A* tetap berhasil 100%, sedangkan RRT* berhasil 80%. GBFS menjadi metode grid tercepat pada 33,8 ms, tetapi biaya rata-ratanya 75,88, lebih buruk daripada UCS dan A* yang berada pada 70,76. Hal ini menunjukkan konsekuensi pemilihan heuristik tanpa memperhitungkan biaya aktual secara penuh.</w:t>
+        <w:t>Pada skenario sulit, UCS dan A* sama-sama berhasil 100% dengan biaya 70,35. A* memproses rata-rata 1030,8 simpul dibanding 1796,8 pada UCS. GBFS paling cepat pada 29,1 ms, tetapi biayanya 75,88. Brute Force berhasil 20% dan RRT* 90%; detour ratio keduanya masing-masing 1,233 dan 1,552.</w:t>
       </w:r>
     </w:p>
     <w:p>
@@ -6746,10 +5751,7 @@
         </w:rPr>
       </w:pPr>
       <w:r>
-        <w:t xml:space="preserve">Pada skenario padat, semua metode menghadapi kondisi paling berat. Brute Force hanya berhasil 20%, sedangkan UCS, GBFS, A*, dan RRT* berhasil 80%. A* kembali mempertahankan biaya sama dengan UCS, yaitu 57,56, sementara GBFS menghasilkan biaya 60,15 dan RRT* 59,49. Waktu UCS dan RRT* meningkat menjadi 732,6 ms dan 686,2 ms karena </w:t>
-      </w:r>
-      <w:r>
-        <w:t>eksplorasi, sampling, dan rewiring lebih sering terhambat ruang bebas yang sempit.</w:t>
+        <w:t>Pada skenario padat, UCS dan A* sama-sama berhasil 100% dengan biaya 57,06. A* memproses rata-rata 373,6 simpul dibanding 1743,3 pada UCS. GBFS paling cepat pada 20,1 ms, tetapi biayanya 60,44. Brute Force berhasil 30% dan RRT* 100%; detour ratio keduanya masing-masing 1,329 dan 1,116.</w:t>
       </w:r>
     </w:p>
     <w:p>
@@ -6778,34 +5780,31 @@
         </w:rPr>
       </w:pPr>
       <w:r>
-        <w:rPr>
-          <w:lang w:val="id-ID"/>
-        </w:rPr>
-        <w:t>Gambar 1 memperlihatkan contoh lintasan pada skenario sulit seed 4, yaitu seed yang menghasilkan lintasan valid untuk semua metode. Brute Force menghasilkan lintasan berupa segmen waypoint, UCS dan A* mengikuti grid biaya minimum, GBFS mengambil rute yang lebih agresif menuju goal, dan RRT* membentuk lintasan kontinu dari pohon sampling.</w:t>
-      </w:r>
-    </w:p>
-    <w:p>
-      <w:r>
-        <w:rPr>
-          <w:noProof/>
-        </w:rPr>
+        <w:t>Gambar 1 memisahkan hasil setiap metode pada skenario Sulit seed 4 agar bentuk lintasan tidak saling menutupi. UCS dan A* menghasilkan rute grid berbiaya sama, GBFS lebih agresif menuju goal, Brute Force menghubungkan waypoint kontinu, dan RRT* membentuk rute dari pohon sampling.</w:t>
+      </w:r>
+    </w:p>
+    <w:p>
+      <w:pPr>
+        <w:keepNext/>
+        <w:jc w:val="center"/>
+      </w:pPr>
+      <w:r>
         <w:drawing>
-          <wp:inline distT="0" distB="0" distL="0" distR="0" wp14:anchorId="5930186D" wp14:editId="26A4843C">
-            <wp:extent cx="2743200" cy="1954892"/>
-            <wp:effectExtent l="0" t="0" r="0" b="7620"/>
-            <wp:docPr id="5" name="Picture 5"/>
+          <wp:inline xmlns:a="http://schemas.openxmlformats.org/drawingml/2006/main" xmlns:pic="http://schemas.openxmlformats.org/drawingml/2006/picture">
+            <wp:extent cx="2971800" cy="1699518"/>
+            <wp:docPr id="2078216891" name="Picture 2078216891"/>
             <wp:cNvGraphicFramePr>
-              <a:graphicFrameLocks xmlns:a="http://schemas.openxmlformats.org/drawingml/2006/main" noChangeAspect="1"/>
+              <a:graphicFrameLocks noChangeAspect="1"/>
             </wp:cNvGraphicFramePr>
-            <a:graphic xmlns:a="http://schemas.openxmlformats.org/drawingml/2006/main">
+            <a:graphic>
               <a:graphicData uri="http://schemas.openxmlformats.org/drawingml/2006/picture">
-                <pic:pic xmlns:pic="http://schemas.openxmlformats.org/drawingml/2006/picture">
+                <pic:pic>
                   <pic:nvPicPr>
                     <pic:cNvPr id="0" name="fig_perbandingan_jalur.png"/>
                     <pic:cNvPicPr/>
                   </pic:nvPicPr>
                   <pic:blipFill>
-                    <a:blip r:embed="rId6"/>
+                    <a:blip r:embed="rId15"/>
                     <a:stretch>
                       <a:fillRect/>
                     </a:stretch>
@@ -6813,11 +5812,9 @@
                   <pic:spPr>
                     <a:xfrm>
                       <a:off x="0" y="0"/>
-                      <a:ext cx="2753020" cy="1961890"/>
+                      <a:ext cx="2971800" cy="1699518"/>
                     </a:xfrm>
-                    <a:prstGeom prst="rect">
-                      <a:avLst/>
-                    </a:prstGeom>
+                    <a:prstGeom prst="rect"/>
                   </pic:spPr>
                 </pic:pic>
               </a:graphicData>
@@ -6849,35 +5846,31 @@
         </w:rPr>
       </w:pPr>
       <w:r>
-        <w:t>Gambar 2 menunjukkan perbandingan waktu eksekusi rata-rata, dengan batang galat yang menyatakan simpangan baku sampel dari lima seed. GBFS menjadi metode grid tercepat pada setiap skenario, sedangkan A* mempertahankan biaya UCS dengan waktu lebih rendah. Variasi waktu membesar pada skenario padat, terutama pada GBFS, A*, dan RRT*, sehingga hasil waktu perlu dibaca bersama variasi antarseed.</w:t>
+        <w:t>Gambar 2 menunjukkan waktu median rata-rata dengan batang galat simpangan baku antarseed. GBFS menjadi metode grid tercepat pada seluruh skenario. Variasi yang tetap terlihat menegaskan bahwa runtime perlu dibaca sebagai distribusi antarpeta, bukan satu pengukuran tunggal.</w:t>
       </w:r>
     </w:p>
     <w:p>
       <w:pPr>
         <w:keepNext/>
-      </w:pPr>
-      <w:r>
-        <w:rPr>
-          <w:noProof/>
-        </w:rPr>
-        <w:lastRenderedPageBreak/>
+        <w:jc w:val="center"/>
+      </w:pPr>
+      <w:r>
         <w:drawing>
-          <wp:inline distT="0" distB="0" distL="0" distR="0" wp14:anchorId="3E5CB51F" wp14:editId="637A8EC8">
-            <wp:extent cx="2743200" cy="1663908"/>
-            <wp:effectExtent l="0" t="0" r="0" b="0"/>
-            <wp:docPr id="2078216889" name="Picture 2078216889"/>
+          <wp:inline xmlns:a="http://schemas.openxmlformats.org/drawingml/2006/main" xmlns:pic="http://schemas.openxmlformats.org/drawingml/2006/picture">
+            <wp:extent cx="2971800" cy="1666142"/>
+            <wp:docPr id="2078216892" name="Picture 2078216892"/>
             <wp:cNvGraphicFramePr>
-              <a:graphicFrameLocks xmlns:a="http://schemas.openxmlformats.org/drawingml/2006/main" noChangeAspect="1"/>
+              <a:graphicFrameLocks noChangeAspect="1"/>
             </wp:cNvGraphicFramePr>
-            <a:graphic xmlns:a="http://schemas.openxmlformats.org/drawingml/2006/main">
+            <a:graphic>
               <a:graphicData uri="http://schemas.openxmlformats.org/drawingml/2006/picture">
-                <pic:pic xmlns:pic="http://schemas.openxmlformats.org/drawingml/2006/picture">
+                <pic:pic>
                   <pic:nvPicPr>
                     <pic:cNvPr id="0" name="fig_waktu_rata_rata.png"/>
                     <pic:cNvPicPr/>
                   </pic:nvPicPr>
                   <pic:blipFill>
-                    <a:blip r:embed="rId7"/>
+                    <a:blip r:embed="rId16"/>
                     <a:stretch>
                       <a:fillRect/>
                     </a:stretch>
@@ -6885,11 +5878,9 @@
                   <pic:spPr>
                     <a:xfrm>
                       <a:off x="0" y="0"/>
-                      <a:ext cx="2748590" cy="1667177"/>
+                      <a:ext cx="2971800" cy="1666142"/>
                     </a:xfrm>
-                    <a:prstGeom prst="rect">
-                      <a:avLst/>
-                    </a:prstGeom>
+                    <a:prstGeom prst="rect"/>
                   </pic:spPr>
                 </pic:pic>
               </a:graphicData>
@@ -6916,34 +5907,31 @@
         <w:keepNext/>
       </w:pPr>
       <w:r>
-        <w:t>Gambar 3 membandingkan jumlah processed pada keluarga pencarian grid, sehingga satuannya konsisten sebagai simpul grid yang diproses. Dibandingkan UCS, A* mengurangi processed sebesar 42,6-87,9%: Mudah 87,9%, Sedang 87,6%, Sulit 42,6%, dan Padat 67,8%. Pada keempat skenario, pengurangan ini tetap menghasilkan biaya lintasan dan tingkat keberhasilan yang sama dengan UCS.</w:t>
+        <w:t>Gambar 3 membandingkan processed UCS, GBFS, dan A*. A* mengurangi processed terhadap UCS sebesar Mudah 88,3%, Sedang 83,1%, Sulit 42,6%, Padat 78,6%. Pengurangan tersebut tetap menghasilkan biaya dan keberhasilan yang sama dengan UCS.</w:t>
       </w:r>
     </w:p>
     <w:p>
       <w:pPr>
         <w:keepNext/>
-      </w:pPr>
-      <w:r>
-        <w:rPr>
-          <w:noProof/>
-        </w:rPr>
+        <w:jc w:val="center"/>
+      </w:pPr>
+      <w:r>
         <w:drawing>
-          <wp:inline distT="0" distB="0" distL="0" distR="0" wp14:anchorId="7C3B1C6B" wp14:editId="6CE6C6C9">
-            <wp:extent cx="2743200" cy="1665149"/>
-            <wp:effectExtent l="0" t="0" r="0" b="0"/>
-            <wp:docPr id="2078216890" name="Picture 2078216890"/>
+          <wp:inline xmlns:a="http://schemas.openxmlformats.org/drawingml/2006/main" xmlns:pic="http://schemas.openxmlformats.org/drawingml/2006/picture">
+            <wp:extent cx="2971800" cy="1676281"/>
+            <wp:docPr id="2078216893" name="Picture 2078216893"/>
             <wp:cNvGraphicFramePr>
-              <a:graphicFrameLocks xmlns:a="http://schemas.openxmlformats.org/drawingml/2006/main" noChangeAspect="1"/>
+              <a:graphicFrameLocks noChangeAspect="1"/>
             </wp:cNvGraphicFramePr>
-            <a:graphic xmlns:a="http://schemas.openxmlformats.org/drawingml/2006/main">
+            <a:graphic>
               <a:graphicData uri="http://schemas.openxmlformats.org/drawingml/2006/picture">
-                <pic:pic xmlns:pic="http://schemas.openxmlformats.org/drawingml/2006/picture">
+                <pic:pic>
                   <pic:nvPicPr>
                     <pic:cNvPr id="0" name="fig_processed_grid.png"/>
                     <pic:cNvPicPr/>
                   </pic:nvPicPr>
                   <pic:blipFill>
-                    <a:blip r:embed="rId8"/>
+                    <a:blip r:embed="rId17"/>
                     <a:stretch>
                       <a:fillRect/>
                     </a:stretch>
@@ -6951,11 +5939,9 @@
                   <pic:spPr>
                     <a:xfrm>
                       <a:off x="0" y="0"/>
-                      <a:ext cx="2747377" cy="1667684"/>
+                      <a:ext cx="2971800" cy="1676281"/>
                     </a:xfrm>
-                    <a:prstGeom prst="rect">
-                      <a:avLst/>
-                    </a:prstGeom>
+                    <a:prstGeom prst="rect"/>
                   </pic:spPr>
                 </pic:pic>
               </a:graphicData>
@@ -6975,7 +5961,126 @@
     </w:p>
     <w:p>
       <w:pPr>
+        <w:pStyle w:val="BodyText"/>
+        <w:keepNext/>
+        <w:pageBreakBefore w:val="0"/>
+      </w:pPr>
+      <w:r>
+        <w:t>Gambar 4 mengevaluasi scaling enam resolusi. Eksponen runtime empiris terhadap jumlah sel adalah UCS 1,01 (R²=1,000), GBFS 0,68 (R²=0,996), dan A* 0,99 (R²=0,999). Pada rentang ini, runtime dan processed UCS/A* meningkat hampir linear terhadap jumlah sel, sedangkan GBFS tumbuh lebih lambat karena frontier yang dieksplorasi tetap sempit.</w:t>
+      </w:r>
+    </w:p>
+    <w:p>
+      <w:pPr>
+        <w:keepNext/>
+        <w:jc w:val="center"/>
+      </w:pPr>
+      <w:r>
+        <w:drawing>
+          <wp:inline xmlns:a="http://schemas.openxmlformats.org/drawingml/2006/main" xmlns:pic="http://schemas.openxmlformats.org/drawingml/2006/picture">
+            <wp:extent cx="2971800" cy="1235034"/>
+            <wp:docPr id="2078216894" name="Picture 2078216894"/>
+            <wp:cNvGraphicFramePr>
+              <a:graphicFrameLocks noChangeAspect="1"/>
+            </wp:cNvGraphicFramePr>
+            <a:graphic>
+              <a:graphicData uri="http://schemas.openxmlformats.org/drawingml/2006/picture">
+                <pic:pic>
+                  <pic:nvPicPr>
+                    <pic:cNvPr id="0" name="fig_grid_scaling.png"/>
+                    <pic:cNvPicPr/>
+                  </pic:nvPicPr>
+                  <pic:blipFill>
+                    <a:blip r:embed="rId18"/>
+                    <a:stretch>
+                      <a:fillRect/>
+                    </a:stretch>
+                  </pic:blipFill>
+                  <pic:spPr>
+                    <a:xfrm>
+                      <a:off x="0" y="0"/>
+                      <a:ext cx="2971800" cy="1235034"/>
+                    </a:xfrm>
+                    <a:prstGeom prst="rect"/>
+                  </pic:spPr>
+                </pic:pic>
+              </a:graphicData>
+            </a:graphic>
+          </wp:inline>
+        </w:drawing>
+      </w:r>
+    </w:p>
+    <w:p>
+      <w:pPr>
+        <w:pStyle w:val="figurecaption"/>
+        <w:jc w:val="center"/>
+      </w:pPr>
+      <w:r>
+        <w:t>Skalabilitas waktu dan processed UCS, GBFS, dan A* terhadap jumlah sel grid.</w:t>
+      </w:r>
+    </w:p>
+    <w:p>
+      <w:pPr>
+        <w:pStyle w:val="BodyText"/>
+        <w:keepNext/>
+        <w:pageBreakBefore w:val="0"/>
+      </w:pPr>
+      <w:r>
+        <w:t>Gambar 5 menunjukkan dampak kepadatan pada peta yang seluruhnya feasible. Saat hambatan meningkat dari 4 menjadi 24, keberhasilan Brute Force turun dari 100% menjadi 50%, sedangkan UCS, GBFS, A*, dan RRT* tetap 100%. Pada 24 hambatan, detour ratio A*/UCS adalah 1,069, GBFS 1,108, dan RRT* 1,134. Dengan demikian, kecepatan GBFS dibayar dengan rute yang lebih panjang, sedangkan keterbatasan kandidat waypoint menjadi sumber utama kegagalan Brute Force.</w:t>
+      </w:r>
+    </w:p>
+    <w:p>
+      <w:pPr>
+        <w:keepNext/>
+        <w:jc w:val="center"/>
+      </w:pPr>
+      <w:r>
+        <w:drawing>
+          <wp:inline xmlns:a="http://schemas.openxmlformats.org/drawingml/2006/main" xmlns:pic="http://schemas.openxmlformats.org/drawingml/2006/picture">
+            <wp:extent cx="2971800" cy="1001304"/>
+            <wp:docPr id="2078216895" name="Picture 2078216895"/>
+            <wp:cNvGraphicFramePr>
+              <a:graphicFrameLocks noChangeAspect="1"/>
+            </wp:cNvGraphicFramePr>
+            <a:graphic>
+              <a:graphicData uri="http://schemas.openxmlformats.org/drawingml/2006/picture">
+                <pic:pic>
+                  <pic:nvPicPr>
+                    <pic:cNvPr id="0" name="fig_density_sweep.png"/>
+                    <pic:cNvPicPr/>
+                  </pic:nvPicPr>
+                  <pic:blipFill>
+                    <a:blip r:embed="rId19"/>
+                    <a:stretch>
+                      <a:fillRect/>
+                    </a:stretch>
+                  </pic:blipFill>
+                  <pic:spPr>
+                    <a:xfrm>
+                      <a:off x="0" y="0"/>
+                      <a:ext cx="2971800" cy="1001304"/>
+                    </a:xfrm>
+                    <a:prstGeom prst="rect"/>
+                  </pic:spPr>
+                </pic:pic>
+              </a:graphicData>
+            </a:graphic>
+          </wp:inline>
+        </w:drawing>
+      </w:r>
+    </w:p>
+    <w:p>
+      <w:pPr>
+        <w:pStyle w:val="figurecaption"/>
+        <w:jc w:val="center"/>
+      </w:pPr>
+      <w:r>
+        <w:t>Keberhasilan, detour ratio, dan waktu terhadap peningkatan jumlah hambatan.</w:t>
+      </w:r>
+    </w:p>
+    <w:p>
+      <w:pPr>
         <w:pStyle w:val="Heading2"/>
+        <w:pageBreakBefore/>
       </w:pPr>
       <w:r>
         <w:t>Analisis Perbandingan Algoritma</w:t>
@@ -7003,10 +6108,7 @@
         </w:rPr>
       </w:pPr>
       <w:r>
-        <w:t xml:space="preserve">Kelompok UCS, GBFS, dan A* memperlihatkan spektrum strategi frontier. UCS paling aman untuk memverifikasi biaya optimal, tetapi cenderung banyak mengekspansi simpul. GBFS sangat cepat karena langsung mengejar goal, tetapi dapat memilih lintasan yang lebih panjang. A* menempati posisi tengah yang paling praktis karena heuristik membantu mengurangi ekspansi tanpa mengorbankan optimalitas pada grid ini. Pada skenario Sulit, A* memproses 1.037 simpul, lebih mendekati UCS yang memproses 1.808 simpul </w:t>
-      </w:r>
-      <w:r>
-        <w:t>daripada pada skenario lain, karena dua dinding dan delapan hambatan memaksa detour melalui ruang bebas terbatas sehingga heuristik Euclidean kurang informatif terhadap biaya sisa.</w:t>
+        <w:t>Kelompok UCS, GBFS, dan A* memperlihatkan spektrum frontier yang konsisten pada eksperimen utama dan scaling. UCS paling menyeluruh, GBFS paling cepat tetapi menghasilkan detour lebih besar, dan A* mempertahankan biaya UCS dengan eksplorasi lebih kecil. Pada skenario Sulit, A* masih memproses 1030,8 simpul dibanding 1796,8 pada UCS karena dinding memaksa detour yang kurang terwakili oleh jarak Euclidean.</w:t>
       </w:r>
     </w:p>
     <w:p>
@@ -7103,16 +6205,13 @@
         </w:rPr>
       </w:pPr>
       <w:r>
-        <w:t xml:space="preserve">Ancaman validitas lain berasal dari jumlah seed yang terbatas, implementasi Python yang belum dioptimasi tingkat rendah, serta parameter Brute Force dan RRT* yang perlu dibatasi agar eksperimen selesai dalam waktu wajar. Tabel utama menampilkan rata-rata agar tetap ringkas, sedangkan data mentah per seed dan simpangan baku disimpan pada CSV hasil eksperimen. Pada skenario Padat, simpangan baku waktu GBFS, A*, dan RRT* masing-masing sekitar 336,8 ms, 207,6 ms, dan 181,6 ms; simpangan baku </w:t>
-      </w:r>
-      <w:r>
-        <w:lastRenderedPageBreak/>
-        <w:t>processed RRT* sekitar 206,8 node. Variasi ini menunjukkan bahwa pengukuran waktu dan metode sampling perlu dibaca bersama sebaran antarseed. Untuk menjaga fairness, seluruh algoritma dijalankan pada peta yang sama, menggunakan perangkat yang sama, dan dievaluasi dengan fungsi validasi tabrakan yang sama untuk memastikan jalur tidak memotong hambatan.</w:t>
+        <w:t>Validitas diperkuat dengan sepuluh seed, peta yang dipastikan feasible, dan tiga pengulangan timing. Namun, regresi scaling hanya menggambarkan rentang 600-9.600 sel dan tidak menggantikan analisis asimtotik. Implementasi Python, parameter waypoint/RRT*, serta bentuk robot titik tetap membatasi generalisasi. Seluruh algoritma dijalankan pada peta, perangkat, dan validator tabrakan yang sama.</w:t>
       </w:r>
     </w:p>
     <w:p>
       <w:pPr>
         <w:pStyle w:val="Heading1"/>
+        <w:pageBreakBefore/>
       </w:pPr>
       <w:r>
         <w:t>Kesimpulan dan Saran</w:t>
@@ -7134,10 +6233,7 @@
         </w:rPr>
       </w:pPr>
       <w:r>
-        <w:rPr>
-          <w:lang w:val="id-ID"/>
-        </w:rPr>
-        <w:t>Berdasarkan eksperimen yang dilakukan, A* menjadi algoritma paling seimbang untuk simulasi pencarian jalur robot sepak bola humanoid berbasis grid. A* menghasilkan biaya lintasan yang sama dengan UCS pada seluruh skenario yang berhasil, tetapi dengan waktu eksekusi dan jumlah ekspansi simpul yang lebih rendah.</w:t>
+        <w:t>Berdasarkan eksperimen utama, scaling, dan density sweep, A* menjadi metode grid paling seimbang. A* mempertahankan biaya dan keberhasilan UCS pada semua peta feasible, tetapi memproses lebih sedikit simpul. Pertumbuhan runtime empiris A* juga mendekati linear terhadap jumlah sel pada rentang uji.</w:t>
       </w:r>
     </w:p>
     <w:p>
@@ -7148,10 +6244,7 @@
         </w:rPr>
       </w:pPr>
       <w:r>
-        <w:rPr>
-          <w:lang w:val="id-ID"/>
-        </w:rPr>
-        <w:t>GBFS terbukti sangat cepat, tetapi tidak menjamin biaya minimum. Brute Force memperlihatkan batas pendekatan enumeratif: performanya masih dapat diterima pada peta sederhana, tetapi tingkat keberhasilannya turun pada skenario sulit dan padat. RRT* menawarkan fleksibilitas ruang kontinu, namun membutuhkan tuning sampling agar stabil.</w:t>
+        <w:t>GBFS konsisten paling cepat, tetapi detour meningkat ketika hambatan bertambah. Brute Force paling cepat kehilangan reliabilitas karena kandidat waypoint terbatas. RRT* tetap relevan untuk ruang kontinu, meskipun waktu dan kualitasnya dipengaruhi sampling.</w:t>
       </w:r>
     </w:p>
     <w:p>
@@ -7327,6 +6420,7 @@
     <w:p>
       <w:pPr>
         <w:pStyle w:val="Heading5"/>
+        <w:pageBreakBefore/>
       </w:pPr>
       <w:r>
         <w:t>References</w:t>
@@ -7475,6 +6569,7 @@
     <w:p>
       <w:pPr>
         <w:pStyle w:val="Heading5"/>
+        <w:pageBreakBefore/>
       </w:pPr>
       <w:r>
         <w:t>PERNYATAAN</w:t>

</xml_diff>